<commit_message>
R5: versión final (registro formal, títulos de tabla al pie según guía UVEG, correcciones de ortografía y sintaxis, revisión de rúbrica)
Co-Authored-By: Claude Sonnet 5.5 <noreply@anthropic.com>
Claude-Session: https://claude.ai/code/session_012HQtHGEWw83YL2w3UxYHZx
</commit_message>
<xml_diff>
--- a/maestria/Navarrete_Arturo_R5_U3.docx
+++ b/maestria/Navarrete_Arturo_R5_U3.docx
@@ -62,6 +62,17 @@
           <w:sz w:val="32"/>
           <w:szCs w:val="32"/>
         </w:rPr>
+        <w:t xml:space="preserve">Nombre de la Universidad: </w:t>
+      </w:r>
+      <w:r>
+        <w:rPr>
+          <w:rFonts w:ascii="Arial" w:cs="Arial" w:eastAsia="Arial" w:hAnsi="Arial"/>
+          <w:b/>
+          <w:bCs/>
+          <w:color w:val="1F4E79"/>
+          <w:sz w:val="32"/>
+          <w:szCs w:val="32"/>
+        </w:rPr>
         <w:t xml:space="preserve">Universidad Virtual del Estado de Guanajuato</w:t>
       </w:r>
     </w:p>
@@ -96,7 +107,7 @@
           <w:sz w:val="32"/>
           <w:szCs w:val="32"/>
         </w:rPr>
-        <w:t xml:space="preserve">Módulo: </w:t>
+        <w:t xml:space="preserve">Nombre del Módulo: </w:t>
       </w:r>
       <w:r>
         <w:rPr>
@@ -124,7 +135,7 @@
           <w:sz w:val="32"/>
           <w:szCs w:val="32"/>
         </w:rPr>
-        <w:t xml:space="preserve">Reto 5: </w:t>
+        <w:t xml:space="preserve">Nombre del Reto: </w:t>
       </w:r>
       <w:r>
         <w:rPr>
@@ -135,7 +146,7 @@
           <w:sz w:val="32"/>
           <w:szCs w:val="32"/>
         </w:rPr>
-        <w:t xml:space="preserve">Propiedad intelectual en la era digital</w:t>
+        <w:t xml:space="preserve">Reto 5. Propiedad intelectual en la era digital</w:t>
       </w:r>
     </w:p>
     <w:p>
@@ -225,7 +236,7 @@
           <w:sz w:val="32"/>
           <w:szCs w:val="32"/>
         </w:rPr>
-        <w:t xml:space="preserve">Nombre del asesor: </w:t>
+        <w:t xml:space="preserve">Nombre de la asesora: </w:t>
       </w:r>
       <w:r>
         <w:rPr>
@@ -393,7 +404,7 @@
           <w:sz w:val="24"/>
           <w:szCs w:val="24"/>
         </w:rPr>
-        <w:t xml:space="preserve">Trabajo desde 2014 en el Centro Interamericano de Estudios de Seguridad Social (CIESS), el órgano de docencia, capacitación e investigación de la Conferencia Interamericana de Seguridad Social (CISS) (CIESS, s.f.-b). Soy diseñador UX/UI y desarrollador: diseño interfaces, administro el sitio web institucional y sus micrositios, desarrollo herramientas para el campus virtual (constancias y actas de calificaciones), mantengo reportes en Google Sheets y desarrollé el sistema de registro del 1er Congreso de Estudios Interamericanos de Seguridad Social (CIESS, s.f.-a). También diseñé el logotipo actual y participé en el rediseño de identidad de 2020 a 2022.</w:t>
+        <w:t xml:space="preserve">Trabajo desde 2014 en el Centro Interamericano de Estudios de Seguridad Social (CIESS), el órgano de docencia, capacitación e investigación de la Conferencia Interamericana de Seguridad Social (CISS) (CIESS, s.f.-b). Soy diseñador de experiencia e interfaz de usuario (UX/UI) y desarrollador: diseño interfaces, administro el sitio web institucional y sus micrositios, desarrollo herramientas para el campus virtual (constancias y actas de calificaciones), mantengo reportes en Google Sheets y desarrollé el sistema de registro del 1er Congreso de Estudios Interamericanos de Seguridad Social (CIESS, s.f.-a). También diseñé el logotipo actual y participé en el rediseño de identidad de 2020 a 2022.</w:t>
       </w:r>
     </w:p>
     <w:p>
@@ -408,7 +419,7 @@
           <w:sz w:val="24"/>
           <w:szCs w:val="24"/>
         </w:rPr>
-        <w:t xml:space="preserve">El sitio del CIESS presenta cursos y eventos (CIESS, s.f.-b) y la Red Interamericana de Universidades para la Seguridad Social, RIUSS (CIESS, s.f.-c). Eso significa que cada día manejo textos, imágenes, videos, código, marcas y bases de datos de participantes de varios países. Todo eso es propiedad intelectual (PI), y todo eso se puede proteger, o violar, con un clic.</w:t>
+        <w:t xml:space="preserve">El sitio del CIESS presenta sus cursos y eventos (CIESS, s.f.-b) y la Red Interamericana de Universidades para la Seguridad Social (RIUSS) (CIESS, s.f.-c). Por ello, a diario manejo textos, imágenes, videos, código, marcas y bases de datos de participantes de varios países. Todo ese material es propiedad intelectual (PI) y, en el entorno digital, su protección o su vulneración pueden depender de una sola acción.</w:t>
       </w:r>
     </w:p>
     <w:p>
@@ -423,7 +434,7 @@
           <w:sz w:val="24"/>
           <w:szCs w:val="24"/>
         </w:rPr>
-        <w:t xml:space="preserve">Este plan atiende dos riesgos informáticos: que otras personas usen sin permiso lo que es del CIESS y que el CIESS use sin permiso lo que es de otras personas. Me apoyé en la Lección 10 (Universidad Virtual del Estado de Guanajuato [UVEG], s.f.), en el capítulo 1 de Uceda Carrillo (2025) y en el artículo de Bernal Guzmán (2025) sobre bases de datos. No soy abogado, así que dejo claro que los puntos legales deben revisarse con el área jurídica antes de aplicarse.</w:t>
+        <w:t xml:space="preserve">Este plan atiende dos riesgos informáticos: el uso no autorizado de la PI del CIESS por parte de terceros y el uso no autorizado, por parte del CIESS, de la PI de terceros. Para elaborarlo utilicé la Lección 10 (Universidad Virtual del Estado de Guanajuato [UVEG], s.f.) y las dos lecturas obligatorias: el capítulo 1 de Uceda Carrillo (2025), sobre cómo proteger los activos intangibles, y el artículo de Bernal Guzmán (2025), sobre bases de datos. Este documento no constituye asesoría jurídica, por lo que los puntos legales deben revisarse con el área jurídica antes de aplicarse.</w:t>
       </w:r>
     </w:p>
     <w:p>
@@ -440,7 +451,7 @@
           <w:sz w:val="24"/>
           <w:szCs w:val="24"/>
         </w:rPr>
-        <w:t xml:space="preserve">Lo que pido a la Dirección:</w:t>
+        <w:t xml:space="preserve">Solicitud a la Dirección del CIESS:</w:t>
       </w:r>
       <w:r>
         <w:rPr>
@@ -448,7 +459,7 @@
           <w:sz w:val="24"/>
           <w:szCs w:val="24"/>
         </w:rPr>
-        <w:t xml:space="preserve"> nombrar a una persona responsable de la PI (puedo serlo con apoyo jurídico), aprobar las políticas cortas del apartado 7 y reservar unas 3 horas por semana durante 6 meses.</w:t>
+        <w:t xml:space="preserve"> designar a una persona responsable de la PI (puedo asumir esa función con apoyo jurídico), aprobar las políticas internas descritas en los apartados 6 y 7 y asignar aproximadamente 3 horas semanales durante 6 meses.</w:t>
       </w:r>
     </w:p>
     <w:p>
@@ -501,7 +512,7 @@
           <w:sz w:val="24"/>
           <w:szCs w:val="24"/>
         </w:rPr>
-        <w:t xml:space="preserve">Antes de hablar de leyes, quise listar lo que realmente hay que cuidar. Los activos de PI que identifiqué en mi trabajo son estos:</w:t>
+        <w:t xml:space="preserve">Como punto de partida, identifiqué los activos de PI del CIESS relacionados con mis funciones:</w:t>
       </w:r>
     </w:p>
     <w:p>
@@ -690,7 +701,7 @@
           <w:sz w:val="24"/>
           <w:szCs w:val="24"/>
         </w:rPr>
-        <w:t xml:space="preserve">Además, el CIESS usa material de terceros: imágenes, fuentes tipográficas, música, </w:t>
+        <w:t xml:space="preserve">Además, el CIESS usa material de terceros: imágenes, tipografías, música, complementos (</w:t>
       </w:r>
       <w:r>
         <w:rPr>
@@ -708,7 +719,7 @@
           <w:sz w:val="24"/>
           <w:szCs w:val="24"/>
         </w:rPr>
-        <w:t xml:space="preserve"> y herramientas de IA. Ese material es el origen del segundo riesgo del plan.</w:t>
+        <w:t xml:space="preserve">) y herramientas de inteligencia artificial (IA). Ese material es el origen del segundo riesgo del plan.</w:t>
       </w:r>
     </w:p>
     <w:p>
@@ -742,7 +753,7 @@
           <w:sz w:val="24"/>
           <w:szCs w:val="24"/>
         </w:rPr>
-        <w:t xml:space="preserve">La PI protege las creaciones de la mente (Organización Mundial de la Propiedad Intelectual [OMPI], 2020). Tiene dos ramas: los derechos de autor, que protegen obras literarias, artísticas, programas de computación y bases de datos, y la propiedad industrial, que protege invenciones, signos distintivos como las marcas y diseños industriales (Uceda Carrillo, 2025). En inglés, </w:t>
+        <w:t xml:space="preserve">La PI protege las creaciones de la mente (Organización Mundial de la Propiedad Intelectual [OMPI], 2020). Tiene dos ramas: los derechos de autor, que protegen obras literarias, artísticas, programas de computación y bases de datos, y la propiedad industrial, que protege las invenciones, los diseños industriales y los signos distintivos, como las marcas (Uceda Carrillo, 2025). En inglés, </w:t>
       </w:r>
       <w:r>
         <w:rPr>
@@ -760,7 +771,7 @@
           <w:sz w:val="24"/>
           <w:szCs w:val="24"/>
         </w:rPr>
-        <w:t xml:space="preserve"> incluye las dos ramas, y traducirla como si fuera solo propiedad industrial es un error frecuente (Uceda Carrillo, 2025).</w:t>
+        <w:t xml:space="preserve"> incluye las dos ramas, pero en español “propiedad intelectual” suele entenderse solo como derechos de autor, por lo que traducir el término de forma automática es un error frecuente (Uceda Carrillo, 2025). En este documento se emplea PI en sentido amplio.</w:t>
       </w:r>
     </w:p>
     <w:p>
@@ -775,7 +786,7 @@
           <w:sz w:val="24"/>
           <w:szCs w:val="24"/>
         </w:rPr>
-        <w:t xml:space="preserve">Los derechos de autor nacen cuando una obra original se fija en un medio tangible, como un archivo o un papel, y no necesitan registro (Uceda Carrillo, 2025). Hay dos clases: los morales (paternidad e integridad), que son inalienables, imprescriptibles e inembargables, y los patrimoniales, que permiten explotar la obra y duran un tiempo limitado (UVEG, s.f.). Algo que me aclaró Uceda Carrillo (2025) es que las ideas no se protegen, solo su expresión.</w:t>
+        <w:t xml:space="preserve">Los derechos de autor nacen cuando una obra original se fija en un medio tangible, como un archivo o un papel, y no necesitan registro (Uceda Carrillo, 2025). Se distinguen dos clases: los morales (paternidad e integridad), que son inalienables, imprescriptibles e inembargables, y los patrimoniales, que permiten explotar la obra y duran un tiempo limitado (UVEG, s.f.). Asimismo, las ideas no se protegen, solo su expresión (Uceda Carrillo, 2025).</w:t>
       </w:r>
     </w:p>
     <w:p>
@@ -790,7 +801,7 @@
           <w:sz w:val="24"/>
           <w:szCs w:val="24"/>
         </w:rPr>
-        <w:t xml:space="preserve">En la propiedad industrial el registro sí es indispensable: los derechos de una marca nacen con él (Uceda Carrillo, 2025). Tiene tres pilares: marcas y nombres comerciales, diseños industriales, y patentes y modelos de utilidad. Las marcas se registran, no se “patentan”, y no existe una “patente mundial”, porque el trámite internacional termina en patentes nacionales o regionales (Uceda Carrillo, 2025).</w:t>
+        <w:t xml:space="preserve">En la propiedad industrial el registro sí es indispensable: los derechos de una marca nacen con él (Uceda Carrillo, 2025). Esta rama tiene tres pilares: marcas y nombres comerciales, diseños industriales, y patentes y modelos de utilidad (Uceda Carrillo, 2025). Las marcas se registran, no se “patentan”, y no existe una “patente mundial”, porque el trámite internacional termina en patentes nacionales o regionales (Uceda Carrillo, 2025).</w:t>
       </w:r>
     </w:p>
     <w:p>
@@ -805,7 +816,7 @@
           <w:sz w:val="24"/>
           <w:szCs w:val="24"/>
         </w:rPr>
-        <w:t xml:space="preserve">En lo digital, la Lección 10 habla de las medidas tecnológicas de protección (MTP) y de la gestión de derechos digitales (DRM, por </w:t>
+        <w:t xml:space="preserve">En el ámbito digital, la Lección 10 aborda las medidas tecnológicas de protección (MTP) y la gestión de derechos digitales (DRM, por </w:t>
       </w:r>
       <w:r>
         <w:rPr>
@@ -823,7 +834,7 @@
           <w:sz w:val="24"/>
           <w:szCs w:val="24"/>
         </w:rPr>
-        <w:t xml:space="preserve">), que limitan quién accede a un contenido y si se puede copiar, descargar o imprimir. También advierte que publicar algo en redes sociales no lo deja libre de derechos (UVEG, s.f.). Las licencias Creative Commons permiten compartir con condiciones: BY (atribución), NC (no comercial), ND (sin derivadas) y SA (compartir igual) (Creative Commons, s.f.).</w:t>
+        <w:t xml:space="preserve">), que limitan quién accede a un contenido y si este puede copiarse, descargarse o imprimirse. También advierte que publicar un contenido en redes sociales no lo exime de la protección de los derechos de autor (UVEG, s.f.). Las licencias Creative Commons permiten compartir con condiciones: BY (atribución), NC (no comercial), ND (sin derivadas) y SA (compartir igual) (Creative Commons, s.f.).</w:t>
       </w:r>
     </w:p>
     <w:p>
@@ -838,7 +849,7 @@
           <w:sz w:val="24"/>
           <w:szCs w:val="24"/>
         </w:rPr>
-        <w:t xml:space="preserve">Proteger tiene sentido porque los activos intangibles pesan mucho: cerca del 90 % del valor de las empresas del índice S&amp;P 500 (Uceda Carrillo, 2025). Ese mismo autor muestra que las marcas suelen sobrevivir a las empresas que las crearon, y recomienda proteger según el valor y los recursos de cada organización.</w:t>
+        <w:t xml:space="preserve">La protección es relevante porque los activos intangibles representan una parte muy importante del valor de las organizaciones: cerca del 90 % de los activos de las compañías del índice S&amp;P 500 son intangibles, como el software, los datos y las marcas (Uceda Carrillo, 2025). Ese mismo autor muestra, con casos como Fagor o Toys “R” Us, que una marca puede sobrevivir a la empresa que la creó, y recomienda proteger según el valor que generan los activos y los recursos disponibles.</w:t>
       </w:r>
     </w:p>
     <w:p>
@@ -872,39 +883,7 @@
           <w:sz w:val="24"/>
           <w:szCs w:val="24"/>
         </w:rPr>
-        <w:t xml:space="preserve">Para el CIESS, con sede en México, tomo la ley mexicana como referencia mínima, como hice con los datos personales en el Reto 3. La Tabla 1 resume qué normas aplican y por qué.</w:t>
-      </w:r>
-    </w:p>
-    <w:p>
-      <w:pPr>
-        <w:keepNext/>
-        <w:spacing w:after="0" w:before="0" w:line="360" w:lineRule="auto"/>
-      </w:pPr>
-      <w:r>
-        <w:rPr>
-          <w:rFonts w:ascii="Arial" w:cs="Arial" w:eastAsia="Arial" w:hAnsi="Arial"/>
-          <w:b/>
-          <w:bCs/>
-          <w:sz w:val="24"/>
-          <w:szCs w:val="24"/>
-        </w:rPr>
-        <w:t xml:space="preserve">Tabla 1</w:t>
-      </w:r>
-    </w:p>
-    <w:p>
-      <w:pPr>
-        <w:keepNext/>
-        <w:spacing w:after="0" w:before="0" w:line="360" w:lineRule="auto"/>
-      </w:pPr>
-      <w:r>
-        <w:rPr>
-          <w:rFonts w:ascii="Arial" w:cs="Arial" w:eastAsia="Arial" w:hAnsi="Arial"/>
-          <w:i/>
-          <w:iCs/>
-          <w:sz w:val="24"/>
-          <w:szCs w:val="24"/>
-        </w:rPr>
-        <w:t xml:space="preserve">Normas mexicanas aplicables a la propiedad intelectual del CIESS</w:t>
+        <w:t xml:space="preserve">Como el CIESS pertenece a un organismo internacional con sede en México (CIESS, s.f.-b), el área jurídica debe confirmar si la ley mexicana se le aplica de forma directa; por prudencia, se toma como referencia mínima, criterio que también apliqué a los datos personales en el Reto 3. La Tabla 1 resume qué normas aplican y por qué.</w:t>
       </w:r>
     </w:p>
     <w:tbl>
@@ -1137,7 +1116,7 @@
                 <w:sz w:val="18"/>
                 <w:szCs w:val="18"/>
               </w:rPr>
-              <w:t xml:space="preserve">Casi todo lo que produce el CIESS son obras: textos, videos, código, interfaces, constancias y bases de datos</w:t>
+              <w:t xml:space="preserve">La mayor parte de los productos del CIESS constituyen obras: textos, videos, código, interfaces, constancias y bases de datos</w:t>
             </w:r>
           </w:p>
         </w:tc>
@@ -1345,7 +1324,7 @@
                 <w:sz w:val="18"/>
                 <w:szCs w:val="18"/>
               </w:rPr>
-              <w:t xml:space="preserve">El CIESS graba ponentes y guarda datos de participantes. La LFDA también pide autorización para usar un retrato (art. 87) o publicar información privada de una base de datos (art. 109)</w:t>
+              <w:t xml:space="preserve">El CIESS graba a ponentes y almacena datos personales de participantes. La LFDA también exige autorización para usar un retrato (art. 87) o publicar información privada contenida en una base de datos (art. 109)</w:t>
             </w:r>
           </w:p>
         </w:tc>
@@ -1449,7 +1428,7 @@
                 <w:sz w:val="18"/>
                 <w:szCs w:val="18"/>
               </w:rPr>
-              <w:t xml:space="preserve">Ahí se registrarían las obras clave y los contratos de cesión</w:t>
+              <w:t xml:space="preserve">Ante esta institución se registrarían las obras clave y los contratos de cesión</w:t>
             </w:r>
           </w:p>
         </w:tc>
@@ -1553,7 +1532,7 @@
                 <w:sz w:val="18"/>
                 <w:szCs w:val="18"/>
               </w:rPr>
-              <w:t xml:space="preserve">Ahí se buscarían y registrarían las marcas, y se vigilaría el boletín</w:t>
+              <w:t xml:space="preserve">Ante esta institución se buscarían y registrarían las marcas, y se vigilaría la Gaceta de la Propiedad Industrial</w:t>
             </w:r>
           </w:p>
         </w:tc>
@@ -1561,6 +1540,21 @@
     </w:tbl>
     <w:p>
       <w:pPr>
+        <w:spacing w:after="80" w:before="80" w:line="240" w:lineRule="auto"/>
+        <w:jc w:val="center"/>
+      </w:pPr>
+      <w:r>
+        <w:rPr>
+          <w:rFonts w:ascii="Arial" w:cs="Arial" w:eastAsia="Arial" w:hAnsi="Arial"/>
+          <w:color w:val="7F7F7F"/>
+          <w:sz w:val="16"/>
+          <w:szCs w:val="16"/>
+        </w:rPr>
+        <w:t xml:space="preserve">Tabla 1. Normas mexicanas aplicables a la propiedad intelectual del CIESS.</w:t>
+      </w:r>
+    </w:p>
+    <w:p>
+      <w:pPr>
         <w:spacing w:after="240" w:before="60" w:line="240" w:lineRule="auto"/>
       </w:pPr>
       <w:r>
@@ -1579,7 +1573,7 @@
           <w:sz w:val="18"/>
           <w:szCs w:val="18"/>
         </w:rPr>
-        <w:t xml:space="preserve"> Resumen mío de las normas citadas. Los artículos deben confirmarse en el texto vigente. Elaboración propia con base en LFDA (2026), LFPPI (2026), LFPDPPP (2025), INDAUTOR (2025) e IMPI (2025).</w:t>
+        <w:t xml:space="preserve"> Resumen propio de las normas citadas. Los artículos deben confirmarse en el texto vigente. Elaboración propia con base en LFDA (2026), LFPPI (2026), LFPDPPP (2025), INDAUTOR (2025) e IMPI (2025).</w:t>
       </w:r>
     </w:p>
     <w:p>
@@ -1594,39 +1588,7 @@
           <w:sz w:val="24"/>
           <w:szCs w:val="24"/>
         </w:rPr>
-        <w:t xml:space="preserve">Lo más importante para mi trabajo es saber de quién es una obra cuando la hace una persona empleada o externa (Tabla 2). Uceda Carrillo (2025) explica que la persona autora siempre es una persona física y que, si una empresa contrata a alguien para diseñar o programar, los derechos de explotación son de quien creó la obra, salvo cesión expresa. En México la LFDA ya trae reglas para varios casos, pero conviene aclararlas por escrito, porque un pacto puede cambiarlas.</w:t>
-      </w:r>
-    </w:p>
-    <w:p>
-      <w:pPr>
-        <w:keepNext/>
-        <w:spacing w:after="0" w:before="0" w:line="360" w:lineRule="auto"/>
-      </w:pPr>
-      <w:r>
-        <w:rPr>
-          <w:rFonts w:ascii="Arial" w:cs="Arial" w:eastAsia="Arial" w:hAnsi="Arial"/>
-          <w:b/>
-          <w:bCs/>
-          <w:sz w:val="24"/>
-          <w:szCs w:val="24"/>
-        </w:rPr>
-        <w:t xml:space="preserve">Tabla 2</w:t>
-      </w:r>
-    </w:p>
-    <w:p>
-      <w:pPr>
-        <w:keepNext/>
-        <w:spacing w:after="0" w:before="0" w:line="360" w:lineRule="auto"/>
-      </w:pPr>
-      <w:r>
-        <w:rPr>
-          <w:rFonts w:ascii="Arial" w:cs="Arial" w:eastAsia="Arial" w:hAnsi="Arial"/>
-          <w:i/>
-          <w:iCs/>
-          <w:sz w:val="24"/>
-          <w:szCs w:val="24"/>
-        </w:rPr>
-        <w:t xml:space="preserve">Quién es titular de una obra según la LFDA</w:t>
+        <w:t xml:space="preserve">Para mis funciones, un aspecto central es determinar la titularidad de una obra cuando la crea una persona empleada o externa (Tabla 2). Uceda Carrillo (2025) explica, con ejemplos de España, que la persona autora siempre es una persona física y que, si una empresa contrata a alguien para diseñar o programar, los derechos de explotación solo pasan a la empresa con una cesión expresa. En México, la LFDA contempla reglas específicas para varios casos (arts. 83, 84 y 103), aunque conviene precisarlas por escrito, porque un pacto puede modificarlas.</w:t>
       </w:r>
     </w:p>
     <w:tbl>
@@ -1783,7 +1745,7 @@
           </w:tcPr>
           <w:p>
             <w:pPr>
-              <w:keepNext w:val="false"/>
+              <w:keepNext/>
               <w:spacing w:after="40" w:before="40" w:line="240" w:lineRule="auto"/>
               <w:jc w:val="left"/>
             </w:pPr>
@@ -1816,7 +1778,7 @@
           </w:tcPr>
           <w:p>
             <w:pPr>
-              <w:keepNext w:val="false"/>
+              <w:keepNext/>
               <w:spacing w:after="40" w:before="40" w:line="240" w:lineRule="auto"/>
               <w:jc w:val="left"/>
             </w:pPr>
@@ -1849,17 +1811,17 @@
           </w:tcPr>
           <w:p>
             <w:pPr>
-              <w:keepNext w:val="false"/>
-              <w:spacing w:after="40" w:before="40" w:line="240" w:lineRule="auto"/>
-              <w:jc w:val="left"/>
-            </w:pPr>
-            <w:r>
-              <w:rPr>
-                <w:rFonts w:ascii="Arial" w:cs="Arial" w:eastAsia="Arial" w:hAnsi="Arial"/>
-                <w:sz w:val="18"/>
-                <w:szCs w:val="18"/>
-              </w:rPr>
-              <w:t xml:space="preserve">Contrato por escrito que diga qué se cede, para qué usos, por cuánto tiempo y cómo se menciona a la persona autora</w:t>
+              <w:keepNext/>
+              <w:spacing w:after="40" w:before="40" w:line="240" w:lineRule="auto"/>
+              <w:jc w:val="left"/>
+            </w:pPr>
+            <w:r>
+              <w:rPr>
+                <w:rFonts w:ascii="Arial" w:cs="Arial" w:eastAsia="Arial" w:hAnsi="Arial"/>
+                <w:sz w:val="18"/>
+                <w:szCs w:val="18"/>
+              </w:rPr>
+              <w:t xml:space="preserve">Contrato por escrito, con pago y plazo, que diga qué se cede, para qué usos y cómo se menciona a la persona autora. Sin escrito la cesión es nula y, sin plazo, se entiende por cinco años (arts. 30 y 33)</w:t>
             </w:r>
           </w:p>
         </w:tc>
@@ -1887,7 +1849,7 @@
           </w:tcPr>
           <w:p>
             <w:pPr>
-              <w:keepNext w:val="false"/>
+              <w:keepNext/>
               <w:spacing w:after="40" w:before="40" w:line="240" w:lineRule="auto"/>
               <w:jc w:val="left"/>
             </w:pPr>
@@ -1920,17 +1882,17 @@
           </w:tcPr>
           <w:p>
             <w:pPr>
-              <w:keepNext w:val="false"/>
-              <w:spacing w:after="40" w:before="40" w:line="240" w:lineRule="auto"/>
-              <w:jc w:val="left"/>
-            </w:pPr>
-            <w:r>
-              <w:rPr>
-                <w:rFonts w:ascii="Arial" w:cs="Arial" w:eastAsia="Arial" w:hAnsi="Arial"/>
-                <w:sz w:val="18"/>
-                <w:szCs w:val="18"/>
-              </w:rPr>
-              <w:t xml:space="preserve">Salvo pacto en contrario, los derechos patrimoniales se dividen por partes iguales entre quien emplea y quien es empleada. El empleador puede divulgar la obra sin autorización.</w:t>
+              <w:keepNext/>
+              <w:spacing w:after="40" w:before="40" w:line="240" w:lineRule="auto"/>
+              <w:jc w:val="left"/>
+            </w:pPr>
+            <w:r>
+              <w:rPr>
+                <w:rFonts w:ascii="Arial" w:cs="Arial" w:eastAsia="Arial" w:hAnsi="Arial"/>
+                <w:sz w:val="18"/>
+                <w:szCs w:val="18"/>
+              </w:rPr>
+              <w:t xml:space="preserve">Salvo pacto en contrario, los derechos patrimoniales se dividen por partes iguales entre quien emplea y quien es empleada. Quien emplea puede divulgar la obra sin autorización.</w:t>
             </w:r>
           </w:p>
         </w:tc>
@@ -1953,7 +1915,7 @@
           </w:tcPr>
           <w:p>
             <w:pPr>
-              <w:keepNext w:val="false"/>
+              <w:keepNext/>
               <w:spacing w:after="40" w:before="40" w:line="240" w:lineRule="auto"/>
               <w:jc w:val="left"/>
             </w:pPr>
@@ -1991,7 +1953,7 @@
           </w:tcPr>
           <w:p>
             <w:pPr>
-              <w:keepNext w:val="false"/>
+              <w:keepNext/>
               <w:spacing w:after="40" w:before="40" w:line="240" w:lineRule="auto"/>
               <w:jc w:val="left"/>
             </w:pPr>
@@ -2024,7 +1986,7 @@
           </w:tcPr>
           <w:p>
             <w:pPr>
-              <w:keepNext w:val="false"/>
+              <w:keepNext/>
               <w:spacing w:after="40" w:before="40" w:line="240" w:lineRule="auto"/>
               <w:jc w:val="left"/>
             </w:pPr>
@@ -2057,17 +2019,17 @@
           </w:tcPr>
           <w:p>
             <w:pPr>
-              <w:keepNext w:val="false"/>
-              <w:spacing w:after="40" w:before="40" w:line="240" w:lineRule="auto"/>
-              <w:jc w:val="left"/>
-            </w:pPr>
-            <w:r>
-              <w:rPr>
-                <w:rFonts w:ascii="Arial" w:cs="Arial" w:eastAsia="Arial" w:hAnsi="Arial"/>
-                <w:sz w:val="18"/>
-                <w:szCs w:val="18"/>
-              </w:rPr>
-              <w:t xml:space="preserve">Formalizar el contrato. Es el caso más riesgoso</w:t>
+              <w:keepNext/>
+              <w:spacing w:after="40" w:before="40" w:line="240" w:lineRule="auto"/>
+              <w:jc w:val="left"/>
+            </w:pPr>
+            <w:r>
+              <w:rPr>
+                <w:rFonts w:ascii="Arial" w:cs="Arial" w:eastAsia="Arial" w:hAnsi="Arial"/>
+                <w:sz w:val="18"/>
+                <w:szCs w:val="18"/>
+              </w:rPr>
+              <w:t xml:space="preserve">Formalizar el contrato. Es el caso de mayor riesgo</w:t>
             </w:r>
           </w:p>
         </w:tc>
@@ -2209,7 +2171,7 @@
                 <w:sz w:val="18"/>
                 <w:szCs w:val="18"/>
               </w:rPr>
-              <w:t xml:space="preserve">Derechos morales de cualquier obra (arts. 18 y 21)</w:t>
+              <w:t xml:space="preserve">Derechos morales de cualquier obra (arts. 18, 19 y 21)</w:t>
             </w:r>
           </w:p>
         </w:tc>
@@ -2242,7 +2204,7 @@
                 <w:sz w:val="18"/>
                 <w:szCs w:val="18"/>
               </w:rPr>
-              <w:t xml:space="preserve">Pertenecen siempre a la persona autora (paternidad e integridad) y no se pueden ceder.</w:t>
+              <w:t xml:space="preserve">Pertenecen siempre a la persona autora (paternidad e integridad) y, por ser inalienables e irrenunciables, no se pueden ceder.</w:t>
             </w:r>
           </w:p>
         </w:tc>
@@ -2283,6 +2245,21 @@
     </w:tbl>
     <w:p>
       <w:pPr>
+        <w:spacing w:after="80" w:before="80" w:line="240" w:lineRule="auto"/>
+        <w:jc w:val="center"/>
+      </w:pPr>
+      <w:r>
+        <w:rPr>
+          <w:rFonts w:ascii="Arial" w:cs="Arial" w:eastAsia="Arial" w:hAnsi="Arial"/>
+          <w:color w:val="7F7F7F"/>
+          <w:sz w:val="16"/>
+          <w:szCs w:val="16"/>
+        </w:rPr>
+        <w:t xml:space="preserve">Tabla 2. Titularidad de las obras según la LFDA.</w:t>
+      </w:r>
+    </w:p>
+    <w:p>
+      <w:pPr>
         <w:spacing w:after="240" w:before="60" w:line="240" w:lineRule="auto"/>
       </w:pPr>
       <w:r>
@@ -2301,7 +2278,7 @@
           <w:sz w:val="18"/>
           <w:szCs w:val="18"/>
         </w:rPr>
-        <w:t xml:space="preserve"> Resumen mío de los artículos citados de la LFDA (2026). Debe confirmarse con el texto vigente y con el área jurídica, porque el régimen laboral del personal del CIESS puede tener reglas propias.</w:t>
+        <w:t xml:space="preserve"> Resumen propio de los artículos citados de la LFDA (2026). Debe confirmarse con el texto vigente y con el área jurídica, porque el régimen laboral del personal del CIESS puede tener reglas propias.</w:t>
       </w:r>
     </w:p>
     <w:p>
@@ -2316,7 +2293,7 @@
           <w:sz w:val="24"/>
           <w:szCs w:val="24"/>
         </w:rPr>
-        <w:t xml:space="preserve">Incumplir estas normas puede traer sanciones administrativas, civiles e incluso penales. No entro al detalle porque corresponde al área jurídica. Sí quiero dejar claro que, en el caso de la IA generativa, INDAUTOR no registra obras creadas exclusivamente con IA (Jalife, 2025).</w:t>
+        <w:t xml:space="preserve">Incumplir estas normas puede traer sanciones administrativas, civiles e incluso penales (LFDA, 2026; LFPPI, 2026). El detalle de las sanciones corresponde al área jurídica. Además, en el caso de la IA generativa, INDAUTOR no registra las obras creadas exclusivamente con IA (Jalife, 2025).</w:t>
       </w:r>
     </w:p>
     <w:p>
@@ -2350,39 +2327,7 @@
           <w:sz w:val="24"/>
           <w:szCs w:val="24"/>
         </w:rPr>
-        <w:t xml:space="preserve">Las organizaciones mundiales más importantes para este tema son dos. La OMPI administra los tratados de PI (OMPI, 2020), y la Organización Mundial del Comercio (OMC) administra el Acuerdo sobre los Aspectos de los Derechos de Propiedad Intelectual relacionados con el Comercio (ADPIC). La Tabla 3 reúne los instrumentos que más me importan, con el motivo por el que aplican.</w:t>
-      </w:r>
-    </w:p>
-    <w:p>
-      <w:pPr>
-        <w:keepNext/>
-        <w:spacing w:after="0" w:before="0" w:line="360" w:lineRule="auto"/>
-      </w:pPr>
-      <w:r>
-        <w:rPr>
-          <w:rFonts w:ascii="Arial" w:cs="Arial" w:eastAsia="Arial" w:hAnsi="Arial"/>
-          <w:b/>
-          <w:bCs/>
-          <w:sz w:val="24"/>
-          <w:szCs w:val="24"/>
-        </w:rPr>
-        <w:t xml:space="preserve">Tabla 3</w:t>
-      </w:r>
-    </w:p>
-    <w:p>
-      <w:pPr>
-        <w:keepNext/>
-        <w:spacing w:after="0" w:before="0" w:line="360" w:lineRule="auto"/>
-      </w:pPr>
-      <w:r>
-        <w:rPr>
-          <w:rFonts w:ascii="Arial" w:cs="Arial" w:eastAsia="Arial" w:hAnsi="Arial"/>
-          <w:i/>
-          <w:iCs/>
-          <w:sz w:val="24"/>
-          <w:szCs w:val="24"/>
-        </w:rPr>
-        <w:t xml:space="preserve">Instrumentos internacionales y su relación con el CIESS</w:t>
+        <w:t xml:space="preserve">Las organizaciones mundiales más importantes para este tema son dos. La OMPI administra tratados de PI como el Convenio de Berna y el Tratado de la OMPI sobre Derecho de Autor, conocido por sus siglas en inglés como WCT (OMPI, 1979, 1996), y la Organización Mundial del Comercio (OMC, 1994) administra el Acuerdo sobre los Aspectos de los Derechos de Propiedad Intelectual relacionados con el Comercio (ADPIC). La Tabla 3 reúne los instrumentos más relevantes y las razones por las que resultan aplicables al CIESS.</w:t>
       </w:r>
     </w:p>
     <w:tbl>
@@ -2582,7 +2527,7 @@
                 <w:sz w:val="18"/>
                 <w:szCs w:val="18"/>
               </w:rPr>
-              <w:t xml:space="preserve">Trato nacional, protección automática sin registro e independencia de la protección (CEDRO, 2024). Mínimo de 50 años tras la muerte de la persona autora (OMPI, 1979). Protege las bases de datos como compilaciones por su selección o disposición (art. 2.5; Bernal Guzmán, 2025)</w:t>
+              <w:t xml:space="preserve">Trato nacional, protección automática sin registro e independencia de la protección (Centro Español de Derechos Reprográficos [CEDRO], 2024). Como regla general, exige un plazo mínimo de 50 años tras la muerte de la persona autora, mientras que México otorga 100 años (OMPI, 1979; LFDA, 2026, art. 29). Protege las bases de datos como compilaciones por su selección o disposición (art. 2.5; Bernal Guzmán, 2025).</w:t>
             </w:r>
           </w:p>
         </w:tc>
@@ -2615,7 +2560,7 @@
                 <w:sz w:val="18"/>
                 <w:szCs w:val="18"/>
               </w:rPr>
-              <w:t xml:space="preserve">Lo que publica el CIESS queda protegido sin trámite en los países miembros, que son los de sus participantes</w:t>
+              <w:t xml:space="preserve">Lo que publica el CIESS queda protegido sin trámite en los países miembros, entre ellos los de la región</w:t>
             </w:r>
           </w:p>
         </w:tc>
@@ -2653,7 +2598,7 @@
                 <w:sz w:val="18"/>
                 <w:szCs w:val="18"/>
               </w:rPr>
-              <w:t xml:space="preserve">Acuerdo sobre los ADPIC (OMC, 1994)</w:t>
+              <w:t xml:space="preserve">Convenio de París (1883)</w:t>
             </w:r>
           </w:p>
         </w:tc>
@@ -2686,7 +2631,7 @@
                 <w:sz w:val="18"/>
                 <w:szCs w:val="18"/>
               </w:rPr>
-              <w:t xml:space="preserve">Exige cumplir lo esencial de Berna, salvo los derechos morales. Protege los programas de computación como obras literarias (art. 10.1), las compilaciones de datos (art. 10.2) y la información no divulgada (art. 39). Obliga a tener formas de hacer valer los derechos (OMC, 1994; Bernal Guzmán, 2025)</w:t>
+              <w:t xml:space="preserve">Trato nacional y derecho de prioridad: tras la primera solicitud, se dispone de 6 meses para solicitar el registro de una marca o de un diseño industrial en otro país miembro, y de 12 para solicitar una patente (OMPI, s.f.).</w:t>
             </w:r>
           </w:p>
         </w:tc>
@@ -2719,7 +2664,7 @@
                 <w:sz w:val="18"/>
                 <w:szCs w:val="18"/>
               </w:rPr>
-              <w:t xml:space="preserve">Es un piso común para los países de la OMC: sirve para el código, las bases de datos y los secretos</w:t>
+              <w:t xml:space="preserve">Si el CIESS registra su marca en México y desea protegerla en otro país, conserva la fecha de la primera solicitud</w:t>
             </w:r>
           </w:p>
         </w:tc>
@@ -2757,7 +2702,7 @@
                 <w:sz w:val="18"/>
                 <w:szCs w:val="18"/>
               </w:rPr>
-              <w:t xml:space="preserve">Tratado de la OMPI sobre Derecho de Autor (WCT, 1996)</w:t>
+              <w:t xml:space="preserve">Acuerdo sobre los ADPIC (OMC, 1994)</w:t>
             </w:r>
           </w:p>
         </w:tc>
@@ -2790,7 +2735,7 @@
                 <w:sz w:val="18"/>
                 <w:szCs w:val="18"/>
               </w:rPr>
-              <w:t xml:space="preserve">Lleva Berna al entorno digital: protege programas y bases de datos (art. 5) y obliga a proteger las medidas tecnológicas contra su evasión (OMPI, 1996; Bernal Guzmán, 2025)</w:t>
+              <w:t xml:space="preserve">Exige cumplir las disposiciones sustantivas del Convenio de Berna, salvo las relativas a los derechos morales. Protege los programas de computación como obras literarias (art. 10.1), las compilaciones de datos (art. 10.2) y la información no divulgada (art. 39). Obliga a los miembros a prever procedimientos para hacer valer los derechos (OMC, 1994; Bernal Guzmán, 2025).</w:t>
             </w:r>
           </w:p>
         </w:tc>
@@ -2823,7 +2768,7 @@
                 <w:sz w:val="18"/>
                 <w:szCs w:val="18"/>
               </w:rPr>
-              <w:t xml:space="preserve">Respalda usar acceso por cuenta y otras medidas técnicas en el campus y el sitio</w:t>
+              <w:t xml:space="preserve">Establece un nivel mínimo común de protección para los países miembros de la OMC, aplicable al código, las bases de datos y los secretos industriales</w:t>
             </w:r>
           </w:p>
         </w:tc>
@@ -2861,7 +2806,7 @@
                 <w:sz w:val="18"/>
                 <w:szCs w:val="18"/>
               </w:rPr>
-              <w:t xml:space="preserve">Sistema de Madrid (OMPI)</w:t>
+              <w:t xml:space="preserve">Tratado de la OMPI sobre Derecho de Autor (WCT, 1996)</w:t>
             </w:r>
           </w:p>
         </w:tc>
@@ -2894,7 +2839,7 @@
                 <w:sz w:val="18"/>
                 <w:szCs w:val="18"/>
               </w:rPr>
-              <w:t xml:space="preserve">Una sola solicitud internacional de marca, con efecto en 131 países y vigencia de 10 años renovable (OMPI, 2025a)</w:t>
+              <w:t xml:space="preserve">Extiende el Convenio de Berna al entorno digital: protege los programas de computación (art. 4) y las compilaciones de datos o bases de datos (art. 5), y obliga a proteger las medidas tecnológicas contra su evasión (art. 11) (Bernal Guzmán, 2025; OMPI, 1996)</w:t>
             </w:r>
           </w:p>
         </w:tc>
@@ -2927,7 +2872,7 @@
                 <w:sz w:val="18"/>
                 <w:szCs w:val="18"/>
               </w:rPr>
-              <w:t xml:space="preserve">Sería la vía más sencilla si el CIESS necesitara su marca protegida en otros países</w:t>
+              <w:t xml:space="preserve">Respalda la implementación del acceso por cuenta y de otras medidas técnicas de protección en el campus virtual y el sitio web</w:t>
             </w:r>
           </w:p>
         </w:tc>
@@ -2955,17 +2900,17 @@
           </w:tcPr>
           <w:p>
             <w:pPr>
-              <w:keepNext/>
-              <w:spacing w:after="40" w:before="40" w:line="240" w:lineRule="auto"/>
-              <w:jc w:val="left"/>
-            </w:pPr>
-            <w:r>
-              <w:rPr>
-                <w:rFonts w:ascii="Arial" w:cs="Arial" w:eastAsia="Arial" w:hAnsi="Arial"/>
-                <w:sz w:val="18"/>
-                <w:szCs w:val="18"/>
-              </w:rPr>
-              <w:t xml:space="preserve">Reglamento General de Protección de Datos de la Unión Europea (RGPD, 2016)</w:t>
+              <w:keepNext w:val="false"/>
+              <w:spacing w:after="40" w:before="40" w:line="240" w:lineRule="auto"/>
+              <w:jc w:val="left"/>
+            </w:pPr>
+            <w:r>
+              <w:rPr>
+                <w:rFonts w:ascii="Arial" w:cs="Arial" w:eastAsia="Arial" w:hAnsi="Arial"/>
+                <w:sz w:val="18"/>
+                <w:szCs w:val="18"/>
+              </w:rPr>
+              <w:t xml:space="preserve">Sistema de Madrid (OMPI)</w:t>
             </w:r>
           </w:p>
         </w:tc>
@@ -2988,17 +2933,17 @@
           </w:tcPr>
           <w:p>
             <w:pPr>
-              <w:keepNext/>
-              <w:spacing w:after="40" w:before="40" w:line="240" w:lineRule="auto"/>
-              <w:jc w:val="left"/>
-            </w:pPr>
-            <w:r>
-              <w:rPr>
-                <w:rFonts w:ascii="Arial" w:cs="Arial" w:eastAsia="Arial" w:hAnsi="Arial"/>
-                <w:sz w:val="18"/>
-                <w:szCs w:val="18"/>
-              </w:rPr>
-              <w:t xml:space="preserve">Protege los datos personales de personas que están en la Unión Europea, incluso frente a organizaciones de fuera que les ofrecen servicios o vigilan su comportamiento (art. 3)</w:t>
+              <w:keepNext w:val="false"/>
+              <w:spacing w:after="40" w:before="40" w:line="240" w:lineRule="auto"/>
+              <w:jc w:val="left"/>
+            </w:pPr>
+            <w:r>
+              <w:rPr>
+                <w:rFonts w:ascii="Arial" w:cs="Arial" w:eastAsia="Arial" w:hAnsi="Arial"/>
+                <w:sz w:val="18"/>
+                <w:szCs w:val="18"/>
+              </w:rPr>
+              <w:t xml:space="preserve">Una sola solicitud internacional de marca, basada en una marca ya solicitada o registrada en el país de origen, para elegir los países donde se quiere protección (más de 130). Vigencia de 10 años renovable (OMPI, 2025b)</w:t>
             </w:r>
           </w:p>
         </w:tc>
@@ -3021,17 +2966,17 @@
           </w:tcPr>
           <w:p>
             <w:pPr>
-              <w:keepNext/>
-              <w:spacing w:after="40" w:before="40" w:line="240" w:lineRule="auto"/>
-              <w:jc w:val="left"/>
-            </w:pPr>
-            <w:r>
-              <w:rPr>
-                <w:rFonts w:ascii="Arial" w:cs="Arial" w:eastAsia="Arial" w:hAnsi="Arial"/>
-                <w:sz w:val="18"/>
-                <w:szCs w:val="18"/>
-              </w:rPr>
-              <w:t xml:space="preserve">Puede aplicar si hay participantes en la Unión Europea, porque su voz, imagen y datos de inscripción son datos personales</w:t>
+              <w:keepNext w:val="false"/>
+              <w:spacing w:after="40" w:before="40" w:line="240" w:lineRule="auto"/>
+              <w:jc w:val="left"/>
+            </w:pPr>
+            <w:r>
+              <w:rPr>
+                <w:rFonts w:ascii="Arial" w:cs="Arial" w:eastAsia="Arial" w:hAnsi="Arial"/>
+                <w:sz w:val="18"/>
+                <w:szCs w:val="18"/>
+              </w:rPr>
+              <w:t xml:space="preserve">Sería la vía más práctica si el CIESS requiriera proteger su marca en otros países, una vez registrada en México</w:t>
             </w:r>
           </w:p>
         </w:tc>
@@ -3069,6 +3014,110 @@
                 <w:sz w:val="18"/>
                 <w:szCs w:val="18"/>
               </w:rPr>
+              <w:t xml:space="preserve">Reglamento General de Protección de Datos de la Unión Europea (RGPD, 2016)</w:t>
+            </w:r>
+          </w:p>
+        </w:tc>
+        <w:tc>
+          <w:tcPr>
+            <w:tcW w:type="dxa" w:w="3700"/>
+            <w:tcBorders>
+              <w:top w:val="single" w:color="7F7F7F" w:sz="4"/>
+              <w:left w:val="single" w:color="7F7F7F" w:sz="4"/>
+              <w:bottom w:val="single" w:color="7F7F7F" w:sz="4"/>
+              <w:right w:val="single" w:color="7F7F7F" w:sz="4"/>
+            </w:tcBorders>
+            <w:tcMar>
+              <w:top w:type="dxa" w:w="40"/>
+              <w:left w:type="dxa" w:w="80"/>
+              <w:bottom w:type="dxa" w:w="40"/>
+              <w:right w:type="dxa" w:w="80"/>
+            </w:tcMar>
+            <w:vAlign w:val="top"/>
+          </w:tcPr>
+          <w:p>
+            <w:pPr>
+              <w:keepNext/>
+              <w:spacing w:after="40" w:before="40" w:line="240" w:lineRule="auto"/>
+              <w:jc w:val="left"/>
+            </w:pPr>
+            <w:r>
+              <w:rPr>
+                <w:rFonts w:ascii="Arial" w:cs="Arial" w:eastAsia="Arial" w:hAnsi="Arial"/>
+                <w:sz w:val="18"/>
+                <w:szCs w:val="18"/>
+              </w:rPr>
+              <w:t xml:space="preserve">Protege los datos personales de personas que están en la Unión Europea, incluso frente a organizaciones establecidas fuera de ella que les ofrecen servicios o vigilan su comportamiento (art. 3).</w:t>
+            </w:r>
+          </w:p>
+        </w:tc>
+        <w:tc>
+          <w:tcPr>
+            <w:tcW w:type="dxa" w:w="3238"/>
+            <w:tcBorders>
+              <w:top w:val="single" w:color="7F7F7F" w:sz="4"/>
+              <w:left w:val="single" w:color="7F7F7F" w:sz="4"/>
+              <w:bottom w:val="single" w:color="7F7F7F" w:sz="4"/>
+              <w:right w:val="single" w:color="7F7F7F" w:sz="4"/>
+            </w:tcBorders>
+            <w:tcMar>
+              <w:top w:type="dxa" w:w="40"/>
+              <w:left w:type="dxa" w:w="80"/>
+              <w:bottom w:type="dxa" w:w="40"/>
+              <w:right w:type="dxa" w:w="80"/>
+            </w:tcMar>
+            <w:vAlign w:val="top"/>
+          </w:tcPr>
+          <w:p>
+            <w:pPr>
+              <w:keepNext/>
+              <w:spacing w:after="40" w:before="40" w:line="240" w:lineRule="auto"/>
+              <w:jc w:val="left"/>
+            </w:pPr>
+            <w:r>
+              <w:rPr>
+                <w:rFonts w:ascii="Arial" w:cs="Arial" w:eastAsia="Arial" w:hAnsi="Arial"/>
+                <w:sz w:val="18"/>
+                <w:szCs w:val="18"/>
+              </w:rPr>
+              <w:t xml:space="preserve">Puede ser aplicable porque la voz, la imagen y los datos de inscripción de los participantes son datos personales, pero solo si el CIESS ofrece cursos o eventos a personas que están en la Unión Europea (no basta con que el sitio sea accesible desde ese territorio).</w:t>
+            </w:r>
+          </w:p>
+        </w:tc>
+      </w:tr>
+      <w:tr>
+        <w:trPr>
+          <w:cantSplit/>
+        </w:trPr>
+        <w:tc>
+          <w:tcPr>
+            <w:tcW w:type="dxa" w:w="1900"/>
+            <w:tcBorders>
+              <w:top w:val="single" w:color="7F7F7F" w:sz="4"/>
+              <w:left w:val="single" w:color="7F7F7F" w:sz="4"/>
+              <w:bottom w:val="single" w:color="7F7F7F" w:sz="4"/>
+              <w:right w:val="single" w:color="7F7F7F" w:sz="4"/>
+            </w:tcBorders>
+            <w:tcMar>
+              <w:top w:type="dxa" w:w="40"/>
+              <w:left w:type="dxa" w:w="80"/>
+              <w:bottom w:type="dxa" w:w="40"/>
+              <w:right w:type="dxa" w:w="80"/>
+            </w:tcMar>
+            <w:vAlign w:val="top"/>
+          </w:tcPr>
+          <w:p>
+            <w:pPr>
+              <w:keepNext/>
+              <w:spacing w:after="40" w:before="40" w:line="240" w:lineRule="auto"/>
+              <w:jc w:val="left"/>
+            </w:pPr>
+            <w:r>
+              <w:rPr>
+                <w:rFonts w:ascii="Arial" w:cs="Arial" w:eastAsia="Arial" w:hAnsi="Arial"/>
+                <w:sz w:val="18"/>
+                <w:szCs w:val="18"/>
+              </w:rPr>
               <w:t xml:space="preserve">Directiva 96/9/CE (Unión Europea)</w:t>
             </w:r>
           </w:p>
@@ -3153,7 +3202,7 @@
                 <w:sz w:val="18"/>
                 <w:szCs w:val="18"/>
               </w:rPr>
-              <w:t xml:space="preserve">Me sirve de referencia: en México solo hay una protección breve para las no originales (LFDA, 2026, art. 108)</w:t>
+              <w:t xml:space="preserve">Es una referencia útil: en México las bases de datos no originales solo tienen 5 años de uso exclusivo (LFDA, 2026, art. 108), frente a los 15 de la Directiva</w:t>
             </w:r>
           </w:p>
         </w:tc>
@@ -3161,6 +3210,21 @@
     </w:tbl>
     <w:p>
       <w:pPr>
+        <w:spacing w:after="80" w:before="80" w:line="240" w:lineRule="auto"/>
+        <w:jc w:val="center"/>
+      </w:pPr>
+      <w:r>
+        <w:rPr>
+          <w:rFonts w:ascii="Arial" w:cs="Arial" w:eastAsia="Arial" w:hAnsi="Arial"/>
+          <w:color w:val="7F7F7F"/>
+          <w:sz w:val="16"/>
+          <w:szCs w:val="16"/>
+        </w:rPr>
+        <w:t xml:space="preserve">Tabla 3. Instrumentos internacionales y su relación con el CIESS.</w:t>
+      </w:r>
+    </w:p>
+    <w:p>
+      <w:pPr>
         <w:spacing w:after="240" w:before="60" w:line="240" w:lineRule="auto"/>
       </w:pPr>
       <w:r>
@@ -3179,7 +3243,7 @@
           <w:sz w:val="18"/>
           <w:szCs w:val="18"/>
         </w:rPr>
-        <w:t xml:space="preserve"> Elaboración propia con base en CEDRO (2024), OMPI (1979, 1996, 2025a), OMC (1994), RGPD (2016) y Bernal Guzmán (2025).</w:t>
+        <w:t xml:space="preserve"> Elaboración propia con base en CEDRO (2024), OMPI (1979, 1996, 2025b), OMC (1994), RGPD (2016) y Bernal Guzmán (2025).</w:t>
       </w:r>
     </w:p>
     <w:p>
@@ -3194,39 +3258,7 @@
           <w:sz w:val="24"/>
           <w:szCs w:val="24"/>
         </w:rPr>
-        <w:t xml:space="preserve">Para saber qué países participan, revisé algunos de la región, más España (Tabla 4). Todos pertenecen a las tres organizaciones. Berna tiene más de 180 países miembros (Uceda Carrillo, 2025), y Madrid cubre 131 (OMPI, 2025a).</w:t>
-      </w:r>
-    </w:p>
-    <w:p>
-      <w:pPr>
-        <w:keepNext/>
-        <w:spacing w:after="0" w:before="0" w:line="360" w:lineRule="auto"/>
-      </w:pPr>
-      <w:r>
-        <w:rPr>
-          <w:rFonts w:ascii="Arial" w:cs="Arial" w:eastAsia="Arial" w:hAnsi="Arial"/>
-          <w:b/>
-          <w:bCs/>
-          <w:sz w:val="24"/>
-          <w:szCs w:val="24"/>
-        </w:rPr>
-        <w:t xml:space="preserve">Tabla 4</w:t>
-      </w:r>
-    </w:p>
-    <w:p>
-      <w:pPr>
-        <w:keepNext/>
-        <w:spacing w:after="0" w:before="0" w:line="360" w:lineRule="auto"/>
-      </w:pPr>
-      <w:r>
-        <w:rPr>
-          <w:rFonts w:ascii="Arial" w:cs="Arial" w:eastAsia="Arial" w:hAnsi="Arial"/>
-          <w:i/>
-          <w:iCs/>
-          <w:sz w:val="24"/>
-          <w:szCs w:val="24"/>
-        </w:rPr>
-        <w:t xml:space="preserve">Países y organizaciones mundiales de propiedad intelectual</w:t>
+        <w:t xml:space="preserve">Para identificar qué países forman parte de estas organizaciones mundiales, revisé algunos países de la región y España (Tabla 4). Todos son parte del Convenio de Berna y del Sistema de Madrid, ambos administrados por la OMPI, y miembros de la OMC, que administra el ADPIC. El Convenio de Berna cuenta con más de 180 países miembros (Uceda Carrillo, 2025), y el Sistema de Madrid abarca más de 130 (OMPI, 2025b).</w:t>
       </w:r>
     </w:p>
     <w:tbl>
@@ -4222,6 +4254,21 @@
     </w:tbl>
     <w:p>
       <w:pPr>
+        <w:spacing w:after="80" w:before="80" w:line="240" w:lineRule="auto"/>
+        <w:jc w:val="center"/>
+      </w:pPr>
+      <w:r>
+        <w:rPr>
+          <w:rFonts w:ascii="Arial" w:cs="Arial" w:eastAsia="Arial" w:hAnsi="Arial"/>
+          <w:color w:val="7F7F7F"/>
+          <w:sz w:val="16"/>
+          <w:szCs w:val="16"/>
+        </w:rPr>
+        <w:t xml:space="preserve">Tabla 4. Pertenencia de países seleccionados a los principales instrumentos internacionales.</w:t>
+      </w:r>
+    </w:p>
+    <w:p>
+      <w:pPr>
         <w:spacing w:after="240" w:before="60" w:line="240" w:lineRule="auto"/>
       </w:pPr>
       <w:r>
@@ -4240,7 +4287,7 @@
           <w:sz w:val="18"/>
           <w:szCs w:val="18"/>
         </w:rPr>
-        <w:t xml:space="preserve"> Elaboración propia con base en OMPI (1979, 2025a) y OMC (1994). La pertenencia de cada país debe confirmarse en los listados oficiales vigentes.</w:t>
+        <w:t xml:space="preserve"> Elaboración propia con base en OMPI (1979, 2025b) y OMC (1994). La pertenencia de cada país debe confirmarse en los listados oficiales vigentes.</w:t>
       </w:r>
     </w:p>
     <w:p>
@@ -4255,7 +4302,7 @@
           <w:sz w:val="24"/>
           <w:szCs w:val="24"/>
         </w:rPr>
-        <w:t xml:space="preserve">De aquí saco dos ideas. Primero, los derechos de autor “viajan” solos: la obra del CIESS queda protegida sin trámite en los países de Berna. Segundo, la propiedad industrial es territorial: una marca registrada en España no protege en Francia ni en México (Uceda Carrillo, 2025). Por eso el logotipo está protegido como obra en muchos países, pero como marca solo donde esté registrado.</w:t>
+        <w:t xml:space="preserve">De lo anterior se derivan dos conclusiones. En primer lugar, los derechos de autor operan a escala internacional sin trámite: la obra del CIESS queda protegida en los países parte del Convenio de Berna (CEDRO, 2024; Uceda Carrillo, 2025). En segundo lugar, la propiedad industrial es territorial: una marca registrada en España no confiere protección en Francia ni en México (Uceda Carrillo, 2025). Por ello, el logotipo está protegido como obra en muchos países, pero como marca solo en aquellos donde esté registrado.</w:t>
       </w:r>
     </w:p>
     <w:p>
@@ -4270,7 +4317,7 @@
           <w:sz w:val="24"/>
           <w:szCs w:val="24"/>
         </w:rPr>
-        <w:t xml:space="preserve">Además, cada país decide de forma distinta de quién es la obra de un empleado, que la Lección 10 señala como un mito que depende del país (UVEG, s.f.). Por eso </w:t>
+        <w:t xml:space="preserve">Además, cada país regula de forma distinta la titularidad de la obra creada por una persona empleada, y la Lección 10 califica como mito la creencia de que siempre corresponde a quien emplea (UVEG, s.f.). Por ello, </w:t>
       </w:r>
       <w:r>
         <w:rPr>
@@ -4280,7 +4327,7 @@
           <w:sz w:val="24"/>
           <w:szCs w:val="24"/>
         </w:rPr>
-        <w:t xml:space="preserve">todo contrato con docentes, ponentes y proveedores debe decir qué ley aplica y quién conserva qué derechos.</w:t>
+        <w:t xml:space="preserve">todo contrato con docentes, ponentes y proveedores debe especificar qué ley es aplicable y quién conserva qué derechos.</w:t>
       </w:r>
     </w:p>
     <w:p>
@@ -4314,39 +4361,7 @@
           <w:sz w:val="24"/>
           <w:szCs w:val="24"/>
         </w:rPr>
-        <w:t xml:space="preserve">Revisé todos los tipos de PI y decidí si se aplican al CIESS (Tabla 5). Un mismo material suele tener más de una protección. Uceda Carrillo (2025) lo ilustra con el juego Trivial Pursuit, que tiene marca, diseño industrial, base de datos y texto protegidos a la vez.</w:t>
-      </w:r>
-    </w:p>
-    <w:p>
-      <w:pPr>
-        <w:keepNext/>
-        <w:spacing w:after="0" w:before="0" w:line="360" w:lineRule="auto"/>
-      </w:pPr>
-      <w:r>
-        <w:rPr>
-          <w:rFonts w:ascii="Arial" w:cs="Arial" w:eastAsia="Arial" w:hAnsi="Arial"/>
-          <w:b/>
-          <w:bCs/>
-          <w:sz w:val="24"/>
-          <w:szCs w:val="24"/>
-        </w:rPr>
-        <w:t xml:space="preserve">Tabla 5</w:t>
-      </w:r>
-    </w:p>
-    <w:p>
-      <w:pPr>
-        <w:keepNext/>
-        <w:spacing w:after="0" w:before="0" w:line="360" w:lineRule="auto"/>
-      </w:pPr>
-      <w:r>
-        <w:rPr>
-          <w:rFonts w:ascii="Arial" w:cs="Arial" w:eastAsia="Arial" w:hAnsi="Arial"/>
-          <w:i/>
-          <w:iCs/>
-          <w:sz w:val="24"/>
-          <w:szCs w:val="24"/>
-        </w:rPr>
-        <w:t xml:space="preserve">Tipos de propiedad intelectual y su aplicación al CIESS</w:t>
+        <w:t xml:space="preserve">Se analizaron todos los tipos de PI para determinar si aplican al CIESS (Tabla 5). Un mismo material suele tener más de una protección. Uceda Carrillo (2025) lo ilustra con el juego Trivial Pursuit, que tiene marca, diseño industrial, base de datos y texto protegidos a la vez.</w:t>
       </w:r>
     </w:p>
     <w:tbl>
@@ -4440,7 +4455,7 @@
                 <w:sz w:val="18"/>
                 <w:szCs w:val="18"/>
               </w:rPr>
-              <w:t xml:space="preserve">Qué protege</w:t>
+              <w:t xml:space="preserve">Objeto de protección</w:t>
             </w:r>
           </w:p>
         </w:tc>
@@ -4476,7 +4491,7 @@
                 <w:sz w:val="18"/>
                 <w:szCs w:val="18"/>
               </w:rPr>
-              <w:t xml:space="preserve">¿Aplica al CIESS y por qué?</w:t>
+              <w:t xml:space="preserve">Aplicabilidad al CIESS y justificación</w:t>
             </w:r>
           </w:p>
         </w:tc>
@@ -4512,7 +4527,7 @@
                 <w:sz w:val="18"/>
                 <w:szCs w:val="18"/>
               </w:rPr>
-              <w:t xml:space="preserve">Se combina con</w:t>
+              <w:t xml:space="preserve">Figuras con las que concurre</w:t>
             </w:r>
           </w:p>
         </w:tc>
@@ -4730,7 +4745,7 @@
                 <w:sz w:val="18"/>
                 <w:szCs w:val="18"/>
               </w:rPr>
-              <w:t xml:space="preserve">Interpretaciones y grabaciones, como la voz y la imagen de quien participa</w:t>
+              <w:t xml:space="preserve">Derechos de quienes interpretan o ejecutan una obra y de quienes producen fonogramas y videogramas (LFDA, 2026)</w:t>
             </w:r>
           </w:p>
         </w:tc>
@@ -4773,7 +4788,7 @@
                 <w:sz w:val="18"/>
                 <w:szCs w:val="18"/>
               </w:rPr>
-              <w:t xml:space="preserve"> Conferencias y sesiones grabadas de ponentes</w:t>
+              <w:t xml:space="preserve"> El CIESS produce las grabaciones de sus conferencias, cursos y pódcast. La voz y la imagen se protegen mediante autorización (LFDA, 2026, art. 87) y conforme a la legislación en materia de datos personales</w:t>
             </w:r>
           </w:p>
         </w:tc>
@@ -4877,7 +4892,7 @@
                 <w:sz w:val="18"/>
                 <w:szCs w:val="18"/>
               </w:rPr>
-              <w:t xml:space="preserve">Signos que distinguen productos y servicios. Se registran ante el IMPI y duran 10 años renovables (Uceda Carrillo, 2025)</w:t>
+              <w:t xml:space="preserve">Signos que distinguen productos y servicios (Uceda Carrillo, 2025). Las marcas y los avisos se registran ante el IMPI y duran 10 años renovables; el nombre comercial se protege por su uso (LFPPI, 2026)</w:t>
             </w:r>
           </w:p>
         </w:tc>
@@ -4991,7 +5006,7 @@
                 <w:sz w:val="18"/>
                 <w:szCs w:val="18"/>
               </w:rPr>
-              <w:t xml:space="preserve">Diseños industriales</w:t>
+              <w:t xml:space="preserve">Reservas de derechos al uso exclusivo</w:t>
             </w:r>
           </w:p>
         </w:tc>
@@ -5024,7 +5039,7 @@
                 <w:sz w:val="18"/>
                 <w:szCs w:val="18"/>
               </w:rPr>
-              <w:t xml:space="preserve">La apariencia de un producto; incluye logotipos e interfaces de usuario (OMPI, 2020)</w:t>
+              <w:t xml:space="preserve">Uso exclusivo de títulos de publicaciones y difusiones periódicas, que otorga INDAUTOR (LFDA, 2026, art. 173)</w:t>
             </w:r>
           </w:p>
         </w:tc>
@@ -5059,15 +5074,15 @@
                 <w:sz w:val="18"/>
                 <w:szCs w:val="18"/>
               </w:rPr>
-              <w:t xml:space="preserve">Sí.</w:t>
-            </w:r>
-            <w:r>
-              <w:rPr>
-                <w:rFonts w:ascii="Arial" w:cs="Arial" w:eastAsia="Arial" w:hAnsi="Arial"/>
-                <w:sz w:val="18"/>
-                <w:szCs w:val="18"/>
-              </w:rPr>
-              <w:t xml:space="preserve"> Logotipo e interfaces del campus, del sitio y del sistema de registro</w:t>
+              <w:t xml:space="preserve">Posible.</w:t>
+            </w:r>
+            <w:r>
+              <w:rPr>
+                <w:rFonts w:ascii="Arial" w:cs="Arial" w:eastAsia="Arial" w:hAnsi="Arial"/>
+                <w:sz w:val="18"/>
+                <w:szCs w:val="18"/>
+              </w:rPr>
+              <w:t xml:space="preserve"> Títulos de boletines, revistas y pódcast con periodicidad regular</w:t>
             </w:r>
           </w:p>
         </w:tc>
@@ -5138,7 +5153,7 @@
                 <w:sz w:val="18"/>
                 <w:szCs w:val="18"/>
               </w:rPr>
-              <w:t xml:space="preserve">Secretos industriales</w:t>
+              <w:t xml:space="preserve">Diseños industriales</w:t>
             </w:r>
           </w:p>
         </w:tc>
@@ -5171,7 +5186,7 @@
                 <w:sz w:val="18"/>
                 <w:szCs w:val="18"/>
               </w:rPr>
-              <w:t xml:space="preserve">Información confidencial con valor competitivo, protegida con medidas razonables (LFPPI, 2026, art. 163; OMPI, 2025b)</w:t>
+              <w:t xml:space="preserve">La apariencia de un producto; incluye logotipos e interfaces de usuario (OMPI, 2020)</w:t>
             </w:r>
           </w:p>
         </w:tc>
@@ -5214,7 +5229,7 @@
                 <w:sz w:val="18"/>
                 <w:szCs w:val="18"/>
               </w:rPr>
-              <w:t xml:space="preserve"> Código no publicado, bases de datos de participantes y modelo de datos del sistema</w:t>
+              <w:t xml:space="preserve"> Logotipo e interfaces del campus, del sitio y del sistema de registro</w:t>
             </w:r>
           </w:p>
         </w:tc>
@@ -5247,7 +5262,7 @@
                 <w:sz w:val="18"/>
                 <w:szCs w:val="18"/>
               </w:rPr>
-              <w:t xml:space="preserve">Derechos de autor</w:t>
+              <w:t xml:space="preserve">Derechos de autor y marca</w:t>
             </w:r>
           </w:p>
         </w:tc>
@@ -5285,7 +5300,7 @@
                 <w:sz w:val="18"/>
                 <w:szCs w:val="18"/>
               </w:rPr>
-              <w:t xml:space="preserve">Patentes</w:t>
+              <w:t xml:space="preserve">Secretos industriales</w:t>
             </w:r>
           </w:p>
         </w:tc>
@@ -5318,7 +5333,7 @@
                 <w:sz w:val="18"/>
                 <w:szCs w:val="18"/>
               </w:rPr>
-              <w:t xml:space="preserve">Invenciones nuevas, con actividad inventiva y aplicación industrial; duran 20 años (LFPPI, 2026)</w:t>
+              <w:t xml:space="preserve">Información confidencial con valor competitivo, conocida solo por pocas personas y protegida con medios suficientes para mantenerla en secreto (LFPPI, 2026, art. 163; OMPI, 2025a)</w:t>
             </w:r>
           </w:p>
         </w:tc>
@@ -5353,15 +5368,15 @@
                 <w:sz w:val="18"/>
                 <w:szCs w:val="18"/>
               </w:rPr>
-              <w:t xml:space="preserve">Por ahora no.</w:t>
-            </w:r>
-            <w:r>
-              <w:rPr>
-                <w:rFonts w:ascii="Arial" w:cs="Arial" w:eastAsia="Arial" w:hAnsi="Arial"/>
-                <w:sz w:val="18"/>
-                <w:szCs w:val="18"/>
-              </w:rPr>
-              <w:t xml:space="preserve"> No hay invenciones técnicas. Un modelo de datos solo sería patentable dentro de una solución técnica nueva (Bernal Guzmán, 2025)</w:t>
+              <w:t xml:space="preserve">Sí.</w:t>
+            </w:r>
+            <w:r>
+              <w:rPr>
+                <w:rFonts w:ascii="Arial" w:cs="Arial" w:eastAsia="Arial" w:hAnsi="Arial"/>
+                <w:sz w:val="18"/>
+                <w:szCs w:val="18"/>
+              </w:rPr>
+              <w:t xml:space="preserve"> Código no publicado, bases de datos de participantes y modelo de datos del sistema</w:t>
             </w:r>
           </w:p>
         </w:tc>
@@ -5394,7 +5409,7 @@
                 <w:sz w:val="18"/>
                 <w:szCs w:val="18"/>
               </w:rPr>
-              <w:t xml:space="preserve">Secreto industrial, mientras no se solicite</w:t>
+              <w:t xml:space="preserve">Derechos de autor</w:t>
             </w:r>
           </w:p>
         </w:tc>
@@ -5422,17 +5437,17 @@
           </w:tcPr>
           <w:p>
             <w:pPr>
-              <w:keepNext/>
-              <w:spacing w:after="40" w:before="40" w:line="240" w:lineRule="auto"/>
-              <w:jc w:val="left"/>
-            </w:pPr>
-            <w:r>
-              <w:rPr>
-                <w:rFonts w:ascii="Arial" w:cs="Arial" w:eastAsia="Arial" w:hAnsi="Arial"/>
-                <w:sz w:val="18"/>
-                <w:szCs w:val="18"/>
-              </w:rPr>
-              <w:t xml:space="preserve">Modelos de utilidad</w:t>
+              <w:keepNext w:val="false"/>
+              <w:spacing w:after="40" w:before="40" w:line="240" w:lineRule="auto"/>
+              <w:jc w:val="left"/>
+            </w:pPr>
+            <w:r>
+              <w:rPr>
+                <w:rFonts w:ascii="Arial" w:cs="Arial" w:eastAsia="Arial" w:hAnsi="Arial"/>
+                <w:sz w:val="18"/>
+                <w:szCs w:val="18"/>
+              </w:rPr>
+              <w:t xml:space="preserve">Patentes</w:t>
             </w:r>
           </w:p>
         </w:tc>
@@ -5455,17 +5470,17 @@
           </w:tcPr>
           <w:p>
             <w:pPr>
-              <w:keepNext/>
-              <w:spacing w:after="40" w:before="40" w:line="240" w:lineRule="auto"/>
-              <w:jc w:val="left"/>
-            </w:pPr>
-            <w:r>
-              <w:rPr>
-                <w:rFonts w:ascii="Arial" w:cs="Arial" w:eastAsia="Arial" w:hAnsi="Arial"/>
-                <w:sz w:val="18"/>
-                <w:szCs w:val="18"/>
-              </w:rPr>
-              <w:t xml:space="preserve">Mejoras funcionales a objetos o herramientas (Uceda Carrillo, 2025)</w:t>
+              <w:keepNext w:val="false"/>
+              <w:spacing w:after="40" w:before="40" w:line="240" w:lineRule="auto"/>
+              <w:jc w:val="left"/>
+            </w:pPr>
+            <w:r>
+              <w:rPr>
+                <w:rFonts w:ascii="Arial" w:cs="Arial" w:eastAsia="Arial" w:hAnsi="Arial"/>
+                <w:sz w:val="18"/>
+                <w:szCs w:val="18"/>
+              </w:rPr>
+              <w:t xml:space="preserve">Invenciones nuevas, con actividad inventiva y aplicación industrial; la patente dura 20 años contados desde la presentación de la solicitud (LFPPI, 2026)</w:t>
             </w:r>
           </w:p>
         </w:tc>
@@ -5488,7 +5503,7 @@
           </w:tcPr>
           <w:p>
             <w:pPr>
-              <w:keepNext/>
+              <w:keepNext w:val="false"/>
               <w:spacing w:after="40" w:before="40" w:line="240" w:lineRule="auto"/>
               <w:jc w:val="left"/>
             </w:pPr>
@@ -5500,15 +5515,15 @@
                 <w:sz w:val="18"/>
                 <w:szCs w:val="18"/>
               </w:rPr>
-              <w:t xml:space="preserve">No.</w:t>
-            </w:r>
-            <w:r>
-              <w:rPr>
-                <w:rFonts w:ascii="Arial" w:cs="Arial" w:eastAsia="Arial" w:hAnsi="Arial"/>
-                <w:sz w:val="18"/>
-                <w:szCs w:val="18"/>
-              </w:rPr>
-              <w:t xml:space="preserve"> El CIESS no fabrica objetos ni herramientas físicas</w:t>
+              <w:t xml:space="preserve">Por ahora no.</w:t>
+            </w:r>
+            <w:r>
+              <w:rPr>
+                <w:rFonts w:ascii="Arial" w:cs="Arial" w:eastAsia="Arial" w:hAnsi="Arial"/>
+                <w:sz w:val="18"/>
+                <w:szCs w:val="18"/>
+              </w:rPr>
+              <w:t xml:space="preserve"> No hay invenciones técnicas, y los programas de computación como tales no se consideran invenciones (LFPPI, 2026, art. 47). Un modelo de datos solo sería patentable dentro de una solución técnica nueva (Bernal Guzmán, 2025, quien lo analiza desde el derecho colombiano).</w:t>
             </w:r>
           </w:p>
         </w:tc>
@@ -5531,17 +5546,17 @@
           </w:tcPr>
           <w:p>
             <w:pPr>
-              <w:keepNext/>
-              <w:spacing w:after="40" w:before="40" w:line="240" w:lineRule="auto"/>
-              <w:jc w:val="left"/>
-            </w:pPr>
-            <w:r>
-              <w:rPr>
-                <w:rFonts w:ascii="Arial" w:cs="Arial" w:eastAsia="Arial" w:hAnsi="Arial"/>
-                <w:sz w:val="18"/>
-                <w:szCs w:val="18"/>
-              </w:rPr>
-              <w:t xml:space="preserve">—</w:t>
+              <w:keepNext w:val="false"/>
+              <w:spacing w:after="40" w:before="40" w:line="240" w:lineRule="auto"/>
+              <w:jc w:val="left"/>
+            </w:pPr>
+            <w:r>
+              <w:rPr>
+                <w:rFonts w:ascii="Arial" w:cs="Arial" w:eastAsia="Arial" w:hAnsi="Arial"/>
+                <w:sz w:val="18"/>
+                <w:szCs w:val="18"/>
+              </w:rPr>
+              <w:t xml:space="preserve">Secreto industrial, mientras no se solicite</w:t>
             </w:r>
           </w:p>
         </w:tc>
@@ -5579,6 +5594,153 @@
                 <w:sz w:val="18"/>
                 <w:szCs w:val="18"/>
               </w:rPr>
+              <w:t xml:space="preserve">Modelos de utilidad</w:t>
+            </w:r>
+          </w:p>
+        </w:tc>
+        <w:tc>
+          <w:tcPr>
+            <w:tcW w:type="dxa" w:w="2550"/>
+            <w:tcBorders>
+              <w:top w:val="single" w:color="7F7F7F" w:sz="4"/>
+              <w:left w:val="single" w:color="7F7F7F" w:sz="4"/>
+              <w:bottom w:val="single" w:color="7F7F7F" w:sz="4"/>
+              <w:right w:val="single" w:color="7F7F7F" w:sz="4"/>
+            </w:tcBorders>
+            <w:tcMar>
+              <w:top w:type="dxa" w:w="40"/>
+              <w:left w:type="dxa" w:w="80"/>
+              <w:bottom w:type="dxa" w:w="40"/>
+              <w:right w:type="dxa" w:w="80"/>
+            </w:tcMar>
+            <w:vAlign w:val="top"/>
+          </w:tcPr>
+          <w:p>
+            <w:pPr>
+              <w:keepNext/>
+              <w:spacing w:after="40" w:before="40" w:line="240" w:lineRule="auto"/>
+              <w:jc w:val="left"/>
+            </w:pPr>
+            <w:r>
+              <w:rPr>
+                <w:rFonts w:ascii="Arial" w:cs="Arial" w:eastAsia="Arial" w:hAnsi="Arial"/>
+                <w:sz w:val="18"/>
+                <w:szCs w:val="18"/>
+              </w:rPr>
+              <w:t xml:space="preserve">Objetos, utensilios, aparatos o herramientas que ganan una función o una ventaja de uso por un cambio en su forma o estructura (LFPPI, 2026; Uceda Carrillo, 2025)</w:t>
+            </w:r>
+          </w:p>
+        </w:tc>
+        <w:tc>
+          <w:tcPr>
+            <w:tcW w:type="dxa" w:w="3200"/>
+            <w:tcBorders>
+              <w:top w:val="single" w:color="7F7F7F" w:sz="4"/>
+              <w:left w:val="single" w:color="7F7F7F" w:sz="4"/>
+              <w:bottom w:val="single" w:color="7F7F7F" w:sz="4"/>
+              <w:right w:val="single" w:color="7F7F7F" w:sz="4"/>
+            </w:tcBorders>
+            <w:tcMar>
+              <w:top w:type="dxa" w:w="40"/>
+              <w:left w:type="dxa" w:w="80"/>
+              <w:bottom w:type="dxa" w:w="40"/>
+              <w:right w:type="dxa" w:w="80"/>
+            </w:tcMar>
+            <w:vAlign w:val="top"/>
+          </w:tcPr>
+          <w:p>
+            <w:pPr>
+              <w:keepNext/>
+              <w:spacing w:after="40" w:before="40" w:line="240" w:lineRule="auto"/>
+              <w:jc w:val="left"/>
+            </w:pPr>
+            <w:r>
+              <w:rPr>
+                <w:rFonts w:ascii="Arial" w:cs="Arial" w:eastAsia="Arial" w:hAnsi="Arial"/>
+                <w:b/>
+                <w:bCs/>
+                <w:sz w:val="18"/>
+                <w:szCs w:val="18"/>
+              </w:rPr>
+              <w:t xml:space="preserve">No.</w:t>
+            </w:r>
+            <w:r>
+              <w:rPr>
+                <w:rFonts w:ascii="Arial" w:cs="Arial" w:eastAsia="Arial" w:hAnsi="Arial"/>
+                <w:sz w:val="18"/>
+                <w:szCs w:val="18"/>
+              </w:rPr>
+              <w:t xml:space="preserve"> El CIESS no fabrica objetos ni herramientas físicas</w:t>
+            </w:r>
+          </w:p>
+        </w:tc>
+        <w:tc>
+          <w:tcPr>
+            <w:tcW w:type="dxa" w:w="1638"/>
+            <w:tcBorders>
+              <w:top w:val="single" w:color="7F7F7F" w:sz="4"/>
+              <w:left w:val="single" w:color="7F7F7F" w:sz="4"/>
+              <w:bottom w:val="single" w:color="7F7F7F" w:sz="4"/>
+              <w:right w:val="single" w:color="7F7F7F" w:sz="4"/>
+            </w:tcBorders>
+            <w:tcMar>
+              <w:top w:type="dxa" w:w="40"/>
+              <w:left w:type="dxa" w:w="80"/>
+              <w:bottom w:type="dxa" w:w="40"/>
+              <w:right w:type="dxa" w:w="80"/>
+            </w:tcMar>
+            <w:vAlign w:val="top"/>
+          </w:tcPr>
+          <w:p>
+            <w:pPr>
+              <w:keepNext/>
+              <w:spacing w:after="40" w:before="40" w:line="240" w:lineRule="auto"/>
+              <w:jc w:val="left"/>
+            </w:pPr>
+            <w:r>
+              <w:rPr>
+                <w:rFonts w:ascii="Arial" w:cs="Arial" w:eastAsia="Arial" w:hAnsi="Arial"/>
+                <w:sz w:val="18"/>
+                <w:szCs w:val="18"/>
+              </w:rPr>
+              <w:t xml:space="preserve">—</w:t>
+            </w:r>
+          </w:p>
+        </w:tc>
+      </w:tr>
+      <w:tr>
+        <w:trPr>
+          <w:cantSplit/>
+        </w:trPr>
+        <w:tc>
+          <w:tcPr>
+            <w:tcW w:type="dxa" w:w="1450"/>
+            <w:tcBorders>
+              <w:top w:val="single" w:color="7F7F7F" w:sz="4"/>
+              <w:left w:val="single" w:color="7F7F7F" w:sz="4"/>
+              <w:bottom w:val="single" w:color="7F7F7F" w:sz="4"/>
+              <w:right w:val="single" w:color="7F7F7F" w:sz="4"/>
+            </w:tcBorders>
+            <w:tcMar>
+              <w:top w:type="dxa" w:w="40"/>
+              <w:left w:type="dxa" w:w="80"/>
+              <w:bottom w:type="dxa" w:w="40"/>
+              <w:right w:type="dxa" w:w="80"/>
+            </w:tcMar>
+            <w:vAlign w:val="top"/>
+          </w:tcPr>
+          <w:p>
+            <w:pPr>
+              <w:keepNext/>
+              <w:spacing w:after="40" w:before="40" w:line="240" w:lineRule="auto"/>
+              <w:jc w:val="left"/>
+            </w:pPr>
+            <w:r>
+              <w:rPr>
+                <w:rFonts w:ascii="Arial" w:cs="Arial" w:eastAsia="Arial" w:hAnsi="Arial"/>
+                <w:sz w:val="18"/>
+                <w:szCs w:val="18"/>
+              </w:rPr>
               <w:t xml:space="preserve">Indicaciones geográficas y denominaciones de origen</w:t>
             </w:r>
           </w:p>
@@ -5612,7 +5774,7 @@
                 <w:sz w:val="18"/>
                 <w:szCs w:val="18"/>
               </w:rPr>
-              <w:t xml:space="preserve">Productos con una calidad ligada a un territorio (LFPPI, 2026)</w:t>
+              <w:t xml:space="preserve">Signos que identifican productos con una calidad o reputación ligada a un territorio; se conceden a un colectivo de productores y no a una persona solicitante (LFPPI, 2026; Uceda Carrillo, 2025)</w:t>
             </w:r>
           </w:p>
         </w:tc>
@@ -5696,6 +5858,21 @@
     </w:tbl>
     <w:p>
       <w:pPr>
+        <w:spacing w:after="80" w:before="80" w:line="240" w:lineRule="auto"/>
+        <w:jc w:val="center"/>
+      </w:pPr>
+      <w:r>
+        <w:rPr>
+          <w:rFonts w:ascii="Arial" w:cs="Arial" w:eastAsia="Arial" w:hAnsi="Arial"/>
+          <w:color w:val="7F7F7F"/>
+          <w:sz w:val="16"/>
+          <w:szCs w:val="16"/>
+        </w:rPr>
+        <w:t xml:space="preserve">Tabla 5. Tipos de propiedad intelectual y su aplicación al CIESS.</w:t>
+      </w:r>
+    </w:p>
+    <w:p>
+      <w:pPr>
         <w:spacing w:after="240" w:before="60" w:line="240" w:lineRule="auto"/>
       </w:pPr>
       <w:r>
@@ -5714,7 +5891,7 @@
           <w:sz w:val="18"/>
           <w:szCs w:val="18"/>
         </w:rPr>
-        <w:t xml:space="preserve"> Elaboración propia con base en LFDA (2026), LFPPI (2026), OMPI (2020, 2025b), Uceda Carrillo (2025) y Bernal Guzmán (2025). Las licencias Creative Commons no son otro tipo de PI: son permisos que da quien tiene los derechos de autor.</w:t>
+        <w:t xml:space="preserve"> Elaboración propia con base en LFDA (2026), LFPPI (2026), OMPI (2020, 2025a), Uceda Carrillo (2025) y Bernal Guzmán (2025). Las licencias Creative Commons no son otro tipo de PI: son autorizaciones que otorga la persona titular de los derechos de autor. El secreto industrial, denominación usada en México, corresponde a lo que la OMPI (2025a) denomina secretos comerciales.</w:t>
       </w:r>
     </w:p>
     <w:p>
@@ -5845,7 +6022,7 @@
           <w:sz w:val="24"/>
           <w:szCs w:val="24"/>
         </w:rPr>
-        <w:t xml:space="preserve"> derecho de autor del video y del material, derechos conexos de la voz e imagen de quien imparte, y la marca del CIESS en pantalla.</w:t>
+        <w:t xml:space="preserve"> derecho de autor del material y de lo que expone quien imparte, derechos conexos del CIESS como productor de la grabación, autorización de voz e imagen, y la marca del CIESS en pantalla.</w:t>
       </w:r>
     </w:p>
     <w:p>
@@ -5860,7 +6037,7 @@
           <w:sz w:val="24"/>
           <w:szCs w:val="24"/>
         </w:rPr>
-        <w:t xml:space="preserve">Las bases de datos fueron lo que más me hizo reflexionar. Bernal Guzmán (2025) explica que el derecho de autor protege la forma en que se selecciona y ordena una base de datos, no los datos en sí. Si la lista de personas inscritas al congreso solo está ordenada por fecha de registro o alfabéticamente, probablemente no sea “original” y no quedaría protegida como obra (Bernal Guzmán, 2025).</w:t>
+        <w:t xml:space="preserve">Entre los diseños industriales del CIESS, el activo más valioso es la apariencia de las interfaces del sitio, del campus y del sistema de registro, así como la del logotipo, porque es el elemento que un tercero tendría mayor probabilidad de copiar para elaborar un sitio falso. En México el diseño se registra ante el IMPI, debe ser nuevo y de aplicación industrial, y dura cinco años, renovables hasta un máximo de 25 (LFPPI, 2026, art. 78); el ADPIC exige protegerlo como mínimo durante 10 años (OMC, 1994, arts. 25 y 26).</w:t>
       </w:r>
     </w:p>
     <w:p>
@@ -5875,7 +6052,7 @@
           <w:sz w:val="24"/>
           <w:szCs w:val="24"/>
         </w:rPr>
-        <w:t xml:space="preserve">Por eso la protegería por otras vías: confidencialidad como secreto industrial, accesos limitados, contratos y la ley de datos personales. La LFDA (2026, art. 109) exige autorización de las personas para publicar información privada de una base de datos. Con el modelo de datos pasa algo parecido: no tiene protección por sí mismo, el código que lo implementa sí, y el secreto industrial es una alternativa (Bernal Guzmán, 2025).</w:t>
+        <w:t xml:space="preserve">Dado que lo publicado hace años podría no cumplir el requisito de novedad, la protección actual de estos diseños se apoya en archivos fuente fechados y en la vigilancia de sitios clonados.</w:t>
       </w:r>
     </w:p>
     <w:p>
@@ -5890,7 +6067,100 @@
           <w:sz w:val="24"/>
           <w:szCs w:val="24"/>
         </w:rPr>
-        <w:t xml:space="preserve">Sobre las patentes, hoy no identifico un desarrollo del CIESS que lo sea: el software se protege como obra literaria (LFDA, 2026, art. 102) y no hay inventos técnicos. Si algún día desarrolláramos un método técnico nuevo, conviene no divulgarlo antes de decidir si se solicita, porque la novedad es un requisito (LFPPI, 2026). Las indicaciones geográficas y los modelos de utilidad tampoco aplican, pero tendré cuidado de no usar denominaciones de origen ajenas en materiales de eventos.</w:t>
+        <w:t xml:space="preserve">En el caso de las bases de datos, Bernal Guzmán (2025) explica que el derecho de autor protege la forma en que se selecciona y ordena una base de datos, no los datos en sí. Si la lista de personas inscritas al congreso solo está ordenada por fecha de registro o por orden alfabético, probablemente no sea “original”: la misma fuente recoge el criterio de la autoridad colombiana de derecho de autor, para la cual ese orden es una labor mecánica sin altura creativa.</w:t>
+      </w:r>
+    </w:p>
+    <w:p>
+      <w:pPr>
+        <w:spacing w:after="0" w:before="0" w:line="360" w:lineRule="auto"/>
+        <w:ind w:firstLine="720"/>
+        <w:jc w:val="both"/>
+      </w:pPr>
+      <w:r>
+        <w:rPr>
+          <w:rFonts w:ascii="Arial" w:cs="Arial" w:eastAsia="Arial" w:hAnsi="Arial"/>
+          <w:sz w:val="24"/>
+          <w:szCs w:val="24"/>
+        </w:rPr>
+        <w:t xml:space="preserve">Aun así, la LFDA (2026, art. 108) otorga a quien elaboró una base de datos no original el uso exclusivo durante 5 años, y esta se protege, además, por otras vías: secreto industrial, accesos limitados, contratos y la legislación en materia de datos personales. La LFDA (2026, art. 109) exige autorización de las personas para publicar información privada de una base de datos. En el caso del modelo de datos, la situación es análoga: carece de protección propia, el código que lo implementa podría protegerse y el secreto industrial constituye una alternativa (Bernal Guzmán, 2025).</w:t>
+      </w:r>
+    </w:p>
+    <w:p>
+      <w:pPr>
+        <w:spacing w:after="0" w:before="0" w:line="360" w:lineRule="auto"/>
+        <w:ind w:firstLine="720"/>
+        <w:jc w:val="both"/>
+      </w:pPr>
+      <w:r>
+        <w:rPr>
+          <w:rFonts w:ascii="Arial" w:cs="Arial" w:eastAsia="Arial" w:hAnsi="Arial"/>
+          <w:sz w:val="24"/>
+          <w:szCs w:val="24"/>
+        </w:rPr>
+        <w:t xml:space="preserve">Los secretos industriales no se registran: dependen de que el CIESS los mantenga en secreto. La LFPPI (2026, art. 163) exige medios suficientes para preservar su confidencialidad, y su artículo 166 obliga a no divulgarlos a quien los conoce por su empleo o relación de negocios y ha sido advertido de su carácter confidencial.</w:t>
+      </w:r>
+    </w:p>
+    <w:p>
+      <w:pPr>
+        <w:spacing w:after="0" w:before="0" w:line="360" w:lineRule="auto"/>
+        <w:ind w:firstLine="720"/>
+        <w:jc w:val="both"/>
+      </w:pPr>
+      <w:r>
+        <w:rPr>
+          <w:rFonts w:ascii="Arial" w:cs="Arial" w:eastAsia="Arial" w:hAnsi="Arial"/>
+          <w:sz w:val="24"/>
+          <w:szCs w:val="24"/>
+        </w:rPr>
+        <w:t xml:space="preserve">Existen riesgos internos (la sustracción del código o el uso compartido de archivos con “cualquier persona con el enlace”) y externos (</w:t>
+      </w:r>
+      <w:r>
+        <w:rPr>
+          <w:rFonts w:ascii="Arial" w:cs="Arial" w:eastAsia="Arial" w:hAnsi="Arial"/>
+          <w:i/>
+          <w:iCs/>
+          <w:sz w:val="24"/>
+          <w:szCs w:val="24"/>
+        </w:rPr>
+        <w:t xml:space="preserve">phishing</w:t>
+      </w:r>
+      <w:r>
+        <w:rPr>
+          <w:rFonts w:ascii="Arial" w:cs="Arial" w:eastAsia="Arial" w:hAnsi="Arial"/>
+          <w:sz w:val="24"/>
+          <w:szCs w:val="24"/>
+        </w:rPr>
+        <w:t xml:space="preserve">, proveedores, herramientas de IA en las que se introduce código). Dado que, según Bernal Guzmán (2025), el secreto industrial deja el modelo de datos expuesto a la ingeniería inversa, el riesgo A3 (Tabla 7) se atiende con acuerdos de confidencialidad (NDA), mínimo privilegio, cifrado y controles de prevención de pérdida de datos (DLP).</w:t>
+      </w:r>
+    </w:p>
+    <w:p>
+      <w:pPr>
+        <w:spacing w:after="0" w:before="0" w:line="360" w:lineRule="auto"/>
+        <w:ind w:firstLine="720"/>
+        <w:jc w:val="both"/>
+      </w:pPr>
+      <w:r>
+        <w:rPr>
+          <w:rFonts w:ascii="Arial" w:cs="Arial" w:eastAsia="Arial" w:hAnsi="Arial"/>
+          <w:sz w:val="24"/>
+          <w:szCs w:val="24"/>
+        </w:rPr>
+        <w:t xml:space="preserve">Sobre las patentes, actualmente no identifico ningún desarrollo del CIESS que sea patentable. Si el CIESS desarrollara un método técnico nuevo, el riesgo informático principal sería la divulgación previa, porque la novedad es un requisito (LFPPI, 2026): lo trataría como secreto industrial, con los controles del riesgo A3, y no lo publicaría en repositorios públicos ni lo ingresaría en herramientas de IA externas hasta decidir si se solicita la patente.</w:t>
+      </w:r>
+    </w:p>
+    <w:p>
+      <w:pPr>
+        <w:spacing w:after="0" w:before="0" w:line="360" w:lineRule="auto"/>
+        <w:ind w:firstLine="720"/>
+        <w:jc w:val="both"/>
+      </w:pPr>
+      <w:r>
+        <w:rPr>
+          <w:rFonts w:ascii="Arial" w:cs="Arial" w:eastAsia="Arial" w:hAnsi="Arial"/>
+          <w:sz w:val="24"/>
+          <w:szCs w:val="24"/>
+        </w:rPr>
+        <w:t xml:space="preserve">Los modelos de utilidad no son aplicables, porque el CIESS no fabrica objetos ni herramientas. Las indicaciones geográficas tampoco lo son, pero los eventos y las tiendas en línea del CIESS podrían mencionarlas, por lo que no usaré una denominación protegida, como tequila o mezcal, en títulos, dominios o anuncios sin confirmar que corresponde a un producto autorizado, y verificaré su declaración ante el IMPI antes de mencionarla. Tampoco son aplicables los esquemas de trazado de circuitos integrados ni las variedades vegetales (Uceda Carrillo, 2025).</w:t>
       </w:r>
     </w:p>
     <w:p>
@@ -5945,39 +6215,7 @@
           <w:sz w:val="24"/>
           <w:szCs w:val="24"/>
         </w:rPr>
-        <w:t xml:space="preserve">Para evaluar cada riesgo usé criterios explícitos (Tabla 6). El nivel es el producto de la probabilidad por el impacto: de 1 a 2 es bajo, de 3 a 4 es medio y de 6 a 9 es alto. El riesgo residual es el nivel que espero después de aplicar los controles. Acepto los residuales bajos y medios con vigilancia, pero un riesgo alto no se acepta.</w:t>
-      </w:r>
-    </w:p>
-    <w:p>
-      <w:pPr>
-        <w:keepNext/>
-        <w:spacing w:after="0" w:before="0" w:line="360" w:lineRule="auto"/>
-      </w:pPr>
-      <w:r>
-        <w:rPr>
-          <w:rFonts w:ascii="Arial" w:cs="Arial" w:eastAsia="Arial" w:hAnsi="Arial"/>
-          <w:b/>
-          <w:bCs/>
-          <w:sz w:val="24"/>
-          <w:szCs w:val="24"/>
-        </w:rPr>
-        <w:t xml:space="preserve">Tabla 6</w:t>
-      </w:r>
-    </w:p>
-    <w:p>
-      <w:pPr>
-        <w:keepNext/>
-        <w:spacing w:after="0" w:before="0" w:line="360" w:lineRule="auto"/>
-      </w:pPr>
-      <w:r>
-        <w:rPr>
-          <w:rFonts w:ascii="Arial" w:cs="Arial" w:eastAsia="Arial" w:hAnsi="Arial"/>
-          <w:i/>
-          <w:iCs/>
-          <w:sz w:val="24"/>
-          <w:szCs w:val="24"/>
-        </w:rPr>
-        <w:t xml:space="preserve">Criterios de probabilidad e impacto</w:t>
+        <w:t xml:space="preserve">Para evaluar cada riesgo usé criterios explícitos (Tabla 6). El nivel es el producto de la probabilidad por el impacto: de 1 a 2 es bajo, de 3 a 4 es medio y de 6 a 9 es alto. El riesgo residual es el nivel que espero después de aplicar los controles: estimo que estos reducen la probabilidad en uno o dos grados y, cuando actúan antes del daño (cifrado en A3, búsqueda previa en B8), también el impacto. Propongo aceptar con vigilancia los riesgos residuales bajos y medios; los riesgos residuales altos no se aceptan.</w:t>
       </w:r>
     </w:p>
     <w:tbl>
@@ -6177,7 +6415,7 @@
                 <w:sz w:val="18"/>
                 <w:szCs w:val="18"/>
               </w:rPr>
-              <w:t xml:space="preserve">No ha pasado y es poco probable</w:t>
+              <w:t xml:space="preserve">No ha ocurrido y es poco probable</w:t>
             </w:r>
           </w:p>
         </w:tc>
@@ -6210,7 +6448,7 @@
                 <w:sz w:val="18"/>
                 <w:szCs w:val="18"/>
               </w:rPr>
-              <w:t xml:space="preserve">Molestia o retrabajo, sin costo ni queja</w:t>
+              <w:t xml:space="preserve">Afectación menor o trabajo adicional, sin costo ni queja</w:t>
             </w:r>
           </w:p>
         </w:tc>
@@ -6281,7 +6519,7 @@
                 <w:sz w:val="18"/>
                 <w:szCs w:val="18"/>
               </w:rPr>
-              <w:t xml:space="preserve">Puede pasar una vez</w:t>
+              <w:t xml:space="preserve">Puede ocurrir una vez</w:t>
             </w:r>
           </w:p>
         </w:tc>
@@ -6385,7 +6623,7 @@
                 <w:sz w:val="18"/>
                 <w:szCs w:val="18"/>
               </w:rPr>
-              <w:t xml:space="preserve">Ya ha pasado o puede pasar varias veces</w:t>
+              <w:t xml:space="preserve">Ya ha ocurrido o puede ocurrir varias veces</w:t>
             </w:r>
           </w:p>
         </w:tc>
@@ -6418,7 +6656,7 @@
                 <w:sz w:val="18"/>
                 <w:szCs w:val="18"/>
               </w:rPr>
-              <w:t xml:space="preserve">Reclamo legal, pérdida de control de la marca o de datos personales, o daño a la imagen</w:t>
+              <w:t xml:space="preserve">Reclamación legal, pérdida de control de la marca o de datos personales, o daño a la reputación institucional</w:t>
             </w:r>
           </w:p>
         </w:tc>
@@ -6426,6 +6664,21 @@
     </w:tbl>
     <w:p>
       <w:pPr>
+        <w:spacing w:after="80" w:before="80" w:line="240" w:lineRule="auto"/>
+        <w:jc w:val="center"/>
+      </w:pPr>
+      <w:r>
+        <w:rPr>
+          <w:rFonts w:ascii="Arial" w:cs="Arial" w:eastAsia="Arial" w:hAnsi="Arial"/>
+          <w:color w:val="7F7F7F"/>
+          <w:sz w:val="16"/>
+          <w:szCs w:val="16"/>
+        </w:rPr>
+        <w:t xml:space="preserve">Tabla 6. Criterios de probabilidad e impacto.</w:t>
+      </w:r>
+    </w:p>
+    <w:p>
+      <w:pPr>
         <w:spacing w:after="240" w:before="60" w:line="240" w:lineRule="auto"/>
       </w:pPr>
       <w:r>
@@ -6444,7 +6697,7 @@
           <w:sz w:val="18"/>
           <w:szCs w:val="18"/>
         </w:rPr>
-        <w:t xml:space="preserve"> Criterios propios, adaptados de la escala que usé en el Reto 4.</w:t>
+        <w:t xml:space="preserve"> Criterios propios.</w:t>
       </w:r>
     </w:p>
     <w:p>
@@ -6465,7 +6718,7 @@
           <w:sz w:val="24"/>
           <w:szCs w:val="24"/>
         </w:rPr>
-        <w:t xml:space="preserve">6.2 Proteger lo que es del CIESS</w:t>
+        <w:t xml:space="preserve">6.2 Protección de la propiedad intelectual del CIESS</w:t>
       </w:r>
     </w:p>
     <w:p>
@@ -6481,38 +6734,6 @@
           <w:szCs w:val="24"/>
         </w:rPr>
         <w:t xml:space="preserve">La Tabla 7 reúne los riesgos de que otras personas usen la PI del CIESS sin permiso.</w:t>
-      </w:r>
-    </w:p>
-    <w:p>
-      <w:pPr>
-        <w:keepNext/>
-        <w:spacing w:after="0" w:before="0" w:line="360" w:lineRule="auto"/>
-      </w:pPr>
-      <w:r>
-        <w:rPr>
-          <w:rFonts w:ascii="Arial" w:cs="Arial" w:eastAsia="Arial" w:hAnsi="Arial"/>
-          <w:b/>
-          <w:bCs/>
-          <w:sz w:val="24"/>
-          <w:szCs w:val="24"/>
-        </w:rPr>
-        <w:t xml:space="preserve">Tabla 7</w:t>
-      </w:r>
-    </w:p>
-    <w:p>
-      <w:pPr>
-        <w:keepNext/>
-        <w:spacing w:after="0" w:before="0" w:line="360" w:lineRule="auto"/>
-      </w:pPr>
-      <w:r>
-        <w:rPr>
-          <w:rFonts w:ascii="Arial" w:cs="Arial" w:eastAsia="Arial" w:hAnsi="Arial"/>
-          <w:i/>
-          <w:iCs/>
-          <w:sz w:val="24"/>
-          <w:szCs w:val="24"/>
-        </w:rPr>
-        <w:t xml:space="preserve">Riesgos de que otras personas usen la propiedad intelectual del CIESS</w:t>
       </w:r>
     </w:p>
     <w:tbl>
@@ -6992,7 +7213,7 @@
                 <w:sz w:val="18"/>
                 <w:szCs w:val="18"/>
               </w:rPr>
-              <w:t xml:space="preserve">Aviso de derechos o licencia visible; acceso por cuenta; marcas de agua y PDF protegidos (MTP y DRM); vigilancia mensual</w:t>
+              <w:t xml:space="preserve">Aviso de derechos o licencia visible; acceso por cuenta; marcas de agua y PDF protegidos (MTP y DRM); alertas por descargas masivas; vigilancia mensual</w:t>
             </w:r>
           </w:p>
         </w:tc>
@@ -7096,7 +7317,7 @@
                 <w:sz w:val="18"/>
                 <w:szCs w:val="18"/>
               </w:rPr>
-              <w:t xml:space="preserve">Uso indebido de la marca o el logotipo: sitios o cursos falsos, suplantación en redes o </w:t>
+              <w:t xml:space="preserve">Uso indebido de la marca, el logotipo o la interfaz: sitios o cursos falsos, suplantación en redes o </w:t>
             </w:r>
             <w:r>
               <w:rPr>
@@ -7240,7 +7461,7 @@
                 <w:sz w:val="18"/>
                 <w:szCs w:val="18"/>
               </w:rPr>
-              <w:t xml:space="preserve">Verificar y registrar las marcas ante el IMPI; guía de uso de marca; vigilar boletín y redes; aviso de cese y reporte a la plataforma</w:t>
+              <w:t xml:space="preserve">Confirmación de la titularidad de las marcas (CIESS o CISS) y su registro ante el IMPI; guía de uso de marca; autenticación del correo institucional; vigilancia de dominios, de la Gaceta de la Propiedad Industrial y de redes; aviso de cese y reporte a la plataforma</w:t>
             </w:r>
           </w:p>
         </w:tc>
@@ -7344,7 +7565,25 @@
                 <w:sz w:val="18"/>
                 <w:szCs w:val="18"/>
               </w:rPr>
-              <w:t xml:space="preserve">Fuga de secretos industriales: código no publicado, bases de datos o informes</w:t>
+              <w:t xml:space="preserve">Fuga de secretos industriales por personal, proveedores, </w:t>
+            </w:r>
+            <w:r>
+              <w:rPr>
+                <w:rFonts w:ascii="Arial" w:cs="Arial" w:eastAsia="Arial" w:hAnsi="Arial"/>
+                <w:i/>
+                <w:iCs/>
+                <w:sz w:val="18"/>
+                <w:szCs w:val="18"/>
+              </w:rPr>
+              <w:t xml:space="preserve">phishing</w:t>
+            </w:r>
+            <w:r>
+              <w:rPr>
+                <w:rFonts w:ascii="Arial" w:cs="Arial" w:eastAsia="Arial" w:hAnsi="Arial"/>
+                <w:sz w:val="18"/>
+                <w:szCs w:val="18"/>
+              </w:rPr>
+              <w:t xml:space="preserve"> o herramientas de IA: código no publicado, bases de datos o informes</w:t>
             </w:r>
           </w:p>
         </w:tc>
@@ -7476,7 +7715,25 @@
                 <w:sz w:val="18"/>
                 <w:szCs w:val="18"/>
               </w:rPr>
-              <w:t xml:space="preserve">Acuerdos de confidencialidad (NDA), mínimo privilegio, cifrado y controles tipo DLP para bloquear envíos a cuentas o nubes externas</w:t>
+              <w:t xml:space="preserve">Acuerdos de confidencialidad (NDA, por </w:t>
+            </w:r>
+            <w:r>
+              <w:rPr>
+                <w:rFonts w:ascii="Arial" w:cs="Arial" w:eastAsia="Arial" w:hAnsi="Arial"/>
+                <w:i/>
+                <w:iCs/>
+                <w:sz w:val="18"/>
+                <w:szCs w:val="18"/>
+              </w:rPr>
+              <w:t xml:space="preserve">non-disclosure agreement</w:t>
+            </w:r>
+            <w:r>
+              <w:rPr>
+                <w:rFonts w:ascii="Arial" w:cs="Arial" w:eastAsia="Arial" w:hAnsi="Arial"/>
+                <w:sz w:val="18"/>
+                <w:szCs w:val="18"/>
+              </w:rPr>
+              <w:t xml:space="preserve">), mínimo privilegio, cifrado, revocación de accesos al concluir la relación y controles de prevención de pérdida de datos (DLP) para bloquear envíos a cuentas o servicios en la nube externos</w:t>
             </w:r>
           </w:p>
         </w:tc>
@@ -8463,6 +8720,21 @@
     </w:tbl>
     <w:p>
       <w:pPr>
+        <w:spacing w:after="80" w:before="80" w:line="240" w:lineRule="auto"/>
+        <w:jc w:val="center"/>
+      </w:pPr>
+      <w:r>
+        <w:rPr>
+          <w:rFonts w:ascii="Arial" w:cs="Arial" w:eastAsia="Arial" w:hAnsi="Arial"/>
+          <w:color w:val="7F7F7F"/>
+          <w:sz w:val="16"/>
+          <w:szCs w:val="16"/>
+        </w:rPr>
+        <w:t xml:space="preserve">Tabla 7. Riesgos de que otras personas usen la propiedad intelectual del CIESS.</w:t>
+      </w:r>
+    </w:p>
+    <w:p>
+      <w:pPr>
         <w:spacing w:after="240" w:before="60" w:line="240" w:lineRule="auto"/>
       </w:pPr>
       <w:r>
@@ -8481,7 +8753,7 @@
           <w:sz w:val="18"/>
           <w:szCs w:val="18"/>
         </w:rPr>
-        <w:t xml:space="preserve"> Prob. = probabilidad. Los valores entre paréntesis son el producto de probabilidad por impacto. Elaboración propia con base en la Lección 10 y Uceda Carrillo (2025).</w:t>
+        <w:t xml:space="preserve"> Prob. = probabilidad. Los valores entre paréntesis son el producto de probabilidad por impacto. Elaboración propia con base en la Lección 10 (UVEG, s.f.), Uceda Carrillo (2025) y Jalife (2025).</w:t>
       </w:r>
     </w:p>
     <w:p>
@@ -8496,25 +8768,7 @@
           <w:sz w:val="24"/>
           <w:szCs w:val="24"/>
         </w:rPr>
-        <w:t xml:space="preserve">Los controles técnicos incluyen acceso por cuenta, cifrado y marcas de agua. El DRM limita quién accede al contenido y si se puede copiar o descargar, y las MTP se apoyan en el WCT (UVEG, s.f.; OMPI, 1996). Agrego controles tipo DLP (</w:t>
-      </w:r>
-      <w:r>
-        <w:rPr>
-          <w:rFonts w:ascii="Arial" w:cs="Arial" w:eastAsia="Arial" w:hAnsi="Arial"/>
-          <w:i/>
-          <w:iCs/>
-          <w:sz w:val="24"/>
-          <w:szCs w:val="24"/>
-        </w:rPr>
-        <w:t xml:space="preserve">Data Loss Prevention</w:t>
-      </w:r>
-      <w:r>
-        <w:rPr>
-          <w:rFonts w:ascii="Arial" w:cs="Arial" w:eastAsia="Arial" w:hAnsi="Arial"/>
-          <w:sz w:val="24"/>
-          <w:szCs w:val="24"/>
-        </w:rPr>
-        <w:t xml:space="preserve">), que detectan o bloquean la salida de información sensible por correo, USB o nube. Las reglas internas dicen quién puede acceder, modificar o compartir documentos, diseños, bases de datos y código, con la lógica de mínimo privilegio del Reto 4.</w:t>
+        <w:t xml:space="preserve">Propongo cinco controles técnicos, que priorizan la protección del código, las bases de datos y los cursos. El control de acceso por cuenta se basa en roles y en autenticación de dos factores para quienes administran el sitio y el campus, con revisión trimestral de quiénes tienen acceso al código y a los reportes. El cifrado cubre la conexión (HTTPS), los respaldos y los archivos con datos personales.</w:t>
       </w:r>
     </w:p>
     <w:p>
@@ -8529,7 +8783,25 @@
           <w:sz w:val="24"/>
           <w:szCs w:val="24"/>
         </w:rPr>
-        <w:t xml:space="preserve">Los mecanismos legales completan esa protección. Cada material lleva un aviso con el símbolo ©, el año y “Todos los derechos reservados” (Uceda Carrillo, 2025), o una licencia Creative Commons si se quiere compartir, por ejemplo CC BY-NC-ND (Creative Commons, s.f.). Los derechos de autor existen sin registro, pero registrar sirve como prueba. Las plataformas privadas de depósito solo acreditan la fecha, no la autoría (Uceda Carrillo, 2025). Las marcas sí necesitan registro, y la fama de una marca no registrada es un atajo temerario.</w:t>
+        <w:t xml:space="preserve">Las marcas de agua permiten rastrear copias. El DRM limita quién accede al contenido y si puede copiarse o descargarse, y las MTP se apoyan en el artículo 11 del WCT (OMPI, 1996; UVEG, s.f.). Los controles DLP (</w:t>
+      </w:r>
+      <w:r>
+        <w:rPr>
+          <w:rFonts w:ascii="Arial" w:cs="Arial" w:eastAsia="Arial" w:hAnsi="Arial"/>
+          <w:i/>
+          <w:iCs/>
+          <w:sz w:val="24"/>
+          <w:szCs w:val="24"/>
+        </w:rPr>
+        <w:t xml:space="preserve">Data Loss Prevention</w:t>
+      </w:r>
+      <w:r>
+        <w:rPr>
+          <w:rFonts w:ascii="Arial" w:cs="Arial" w:eastAsia="Arial" w:hAnsi="Arial"/>
+          <w:sz w:val="24"/>
+          <w:szCs w:val="24"/>
+        </w:rPr>
+        <w:t xml:space="preserve">) bloquean la salida de información sensible por correo electrónico, dispositivos USB o servicios en la nube.</w:t>
       </w:r>
     </w:p>
     <w:p>
@@ -8544,7 +8816,70 @@
           <w:sz w:val="24"/>
           <w:szCs w:val="24"/>
         </w:rPr>
-        <w:t xml:space="preserve">Con las marcas voy a vigilar el boletín del IMPI y las redes al menos una vez al mes, como recomienda Uceda Carrillo (2025), y a repartir una guía corta de uso de la marca para que el personal la use bien. Los costos de registro deben cotizarse con las tarifas vigentes del IMPI y de INDAUTOR, porque no los conozco con certeza.</w:t>
+        <w:t xml:space="preserve">Estos controles se apoyan en cinco políticas internas de una página sobre quién puede acceder, modificar o compartir documentos, diseños, bases de datos y código: acceso y uso compartido (con el mínimo privilegio del Reto 4), material de terceros, uso de IA, uso de la marca y confidencialidad.</w:t>
+      </w:r>
+    </w:p>
+    <w:p>
+      <w:pPr>
+        <w:spacing w:after="0" w:before="0" w:line="360" w:lineRule="auto"/>
+        <w:ind w:firstLine="720"/>
+        <w:jc w:val="both"/>
+      </w:pPr>
+      <w:r>
+        <w:rPr>
+          <w:rFonts w:ascii="Arial" w:cs="Arial" w:eastAsia="Arial" w:hAnsi="Arial"/>
+          <w:sz w:val="24"/>
+          <w:szCs w:val="24"/>
+        </w:rPr>
+        <w:t xml:space="preserve">Los mecanismos legales completan esa protección. Cada material publicado lleva el aviso que exige la LFDA (2026, art. 17): “Derechos Reservados” o “D. R.”, el símbolo ©, el nombre y la dirección de la persona titular de los derechos y el año de la primera publicación (Uceda Carrillo, 2025). Si se desea compartir el material, se usa una licencia Creative Commons, por ejemplo CC BY-NC-ND (Creative Commons, s.f.). También propongo acuerdos de confidencialidad, cláusulas de PI en los contratos y acuerdos de licencia con las universidades de la RIUSS.</w:t>
+      </w:r>
+    </w:p>
+    <w:p>
+      <w:pPr>
+        <w:spacing w:after="0" w:before="0" w:line="360" w:lineRule="auto"/>
+        <w:ind w:firstLine="720"/>
+        <w:jc w:val="both"/>
+      </w:pPr>
+      <w:r>
+        <w:rPr>
+          <w:rFonts w:ascii="Arial" w:cs="Arial" w:eastAsia="Arial" w:hAnsi="Arial"/>
+          <w:sz w:val="24"/>
+          <w:szCs w:val="24"/>
+        </w:rPr>
+        <w:t xml:space="preserve">Registrar la obra facilita la prueba en una controversia, pero las plataformas privadas de depósito solo acreditan la fecha, no la autoría. Los derechos de una marca, en cambio, nacen con el registro, y confiar en la notoriedad de una marca no registrada constituye una práctica de alto riesgo (Uceda Carrillo, 2025).</w:t>
+      </w:r>
+    </w:p>
+    <w:p>
+      <w:pPr>
+        <w:spacing w:after="0" w:before="0" w:line="360" w:lineRule="auto"/>
+        <w:ind w:firstLine="720"/>
+        <w:jc w:val="both"/>
+      </w:pPr>
+      <w:r>
+        <w:rPr>
+          <w:rFonts w:ascii="Arial" w:cs="Arial" w:eastAsia="Arial" w:hAnsi="Arial"/>
+          <w:sz w:val="24"/>
+          <w:szCs w:val="24"/>
+        </w:rPr>
+        <w:t xml:space="preserve">Para proteger las marcas, revisaré al menos una vez al mes la Gaceta de la Propiedad Industrial del IMPI, equivalente al boletín oficial que Uceda Carrillo (2025) recomienda vigilar en España, así como las redes y los dominios similares al del CIESS. Para mitigar el </w:t>
+      </w:r>
+      <w:r>
+        <w:rPr>
+          <w:rFonts w:ascii="Arial" w:cs="Arial" w:eastAsia="Arial" w:hAnsi="Arial"/>
+          <w:i/>
+          <w:iCs/>
+          <w:sz w:val="24"/>
+          <w:szCs w:val="24"/>
+        </w:rPr>
+        <w:t xml:space="preserve">phishing</w:t>
+      </w:r>
+      <w:r>
+        <w:rPr>
+          <w:rFonts w:ascii="Arial" w:cs="Arial" w:eastAsia="Arial" w:hAnsi="Arial"/>
+          <w:sz w:val="24"/>
+          <w:szCs w:val="24"/>
+        </w:rPr>
+        <w:t xml:space="preserve"> y la suplantación de identidad, propongo autenticar el correo institucional (protocolos SPF, DKIM y DMARC), mantener cuentas oficiales verificadas y conservar evidencia para solicitar el retiro del contenido a la plataforma o al registrador. Los costos de registro deben cotizarse con las tarifas vigentes del IMPI y de INDAUTOR, porque no se dispone de cifras confirmadas.</w:t>
       </w:r>
     </w:p>
     <w:p>
@@ -8565,7 +8900,7 @@
           <w:sz w:val="24"/>
           <w:szCs w:val="24"/>
         </w:rPr>
-        <w:t xml:space="preserve">6.3 Controlar que el CIESS no use material indebido</w:t>
+        <w:t xml:space="preserve">6.3 Control del uso de propiedad intelectual de terceros</w:t>
       </w:r>
     </w:p>
     <w:p>
@@ -8581,38 +8916,6 @@
           <w:szCs w:val="24"/>
         </w:rPr>
         <w:t xml:space="preserve">La Tabla 8 reúne los riesgos de que el CIESS use PI de otras personas sin permiso.</w:t>
-      </w:r>
-    </w:p>
-    <w:p>
-      <w:pPr>
-        <w:keepNext/>
-        <w:spacing w:after="0" w:before="0" w:line="360" w:lineRule="auto"/>
-      </w:pPr>
-      <w:r>
-        <w:rPr>
-          <w:rFonts w:ascii="Arial" w:cs="Arial" w:eastAsia="Arial" w:hAnsi="Arial"/>
-          <w:b/>
-          <w:bCs/>
-          <w:sz w:val="24"/>
-          <w:szCs w:val="24"/>
-        </w:rPr>
-        <w:t xml:space="preserve">Tabla 8</w:t>
-      </w:r>
-    </w:p>
-    <w:p>
-      <w:pPr>
-        <w:keepNext/>
-        <w:spacing w:after="0" w:before="0" w:line="360" w:lineRule="auto"/>
-      </w:pPr>
-      <w:r>
-        <w:rPr>
-          <w:rFonts w:ascii="Arial" w:cs="Arial" w:eastAsia="Arial" w:hAnsi="Arial"/>
-          <w:i/>
-          <w:iCs/>
-          <w:sz w:val="24"/>
-          <w:szCs w:val="24"/>
-        </w:rPr>
-        <w:t xml:space="preserve">Riesgos de que el CIESS use propiedad intelectual de otras personas</w:t>
       </w:r>
     </w:p>
     <w:tbl>
@@ -9434,7 +9737,7 @@
                 <w:sz w:val="18"/>
                 <w:szCs w:val="18"/>
               </w:rPr>
-              <w:t xml:space="preserve">Software de terceros: licencias de código abierto con condiciones o </w:t>
+              <w:t xml:space="preserve">Software de terceros: incumplimiento de las condiciones de licencias de código abierto o uso de </w:t>
             </w:r>
             <w:r>
               <w:rPr>
@@ -9452,7 +9755,7 @@
                 <w:sz w:val="18"/>
                 <w:szCs w:val="18"/>
               </w:rPr>
-              <w:t xml:space="preserve"> pirateados</w:t>
+              <w:t xml:space="preserve"> sin licencia</w:t>
             </w:r>
           </w:p>
         </w:tc>
@@ -9584,7 +9887,7 @@
                 <w:sz w:val="18"/>
                 <w:szCs w:val="18"/>
               </w:rPr>
-              <w:t xml:space="preserve">Inventario de bibliotecas y licencias; solo repositorios oficiales; prohibido el software sin licencia</w:t>
+              <w:t xml:space="preserve">Inventario de bibliotecas y licencias; uso exclusivo de repositorios oficiales; prohibición de software sin licencia</w:t>
             </w:r>
           </w:p>
         </w:tc>
@@ -10058,7 +10361,7 @@
                 <w:sz w:val="18"/>
                 <w:szCs w:val="18"/>
               </w:rPr>
-              <w:t xml:space="preserve">Formato de autorización firmado para obra, voz e imagen; retirar el contenido si lo piden</w:t>
+              <w:t xml:space="preserve">Formato de autorización firmado para obra, voz e imagen; retirar el contenido cuando la persona lo solicite</w:t>
             </w:r>
           </w:p>
         </w:tc>
@@ -10162,7 +10465,7 @@
                 <w:sz w:val="18"/>
                 <w:szCs w:val="18"/>
               </w:rPr>
-              <w:t xml:space="preserve">IA generativa que reproduce obras protegidas o se alimenta con bases de datos sin licencia o con datos personales</w:t>
+              <w:t xml:space="preserve">IA generativa que reproduce obras protegidas o se entrena con bases de datos sin licencia o con datos personales</w:t>
             </w:r>
           </w:p>
         </w:tc>
@@ -10294,7 +10597,7 @@
                 <w:sz w:val="18"/>
                 <w:szCs w:val="18"/>
               </w:rPr>
-              <w:t xml:space="preserve">Política de uso de IA: revisión humana, no ingresar material ajeno ni datos personales</w:t>
+              <w:t xml:space="preserve">Política de uso de IA: revisión humana y prohibición de ingresar material ajeno o datos personales</w:t>
             </w:r>
           </w:p>
         </w:tc>
@@ -10634,7 +10937,7 @@
                 <w:sz w:val="18"/>
                 <w:szCs w:val="18"/>
               </w:rPr>
-              <w:t xml:space="preserve">Nombrar un curso o evento con un nombre ya registrado por otra persona</w:t>
+              <w:t xml:space="preserve">Uso, para un curso o evento, de un nombre ya registrado por otra persona</w:t>
             </w:r>
           </w:p>
         </w:tc>
@@ -10766,7 +11069,7 @@
                 <w:sz w:val="18"/>
                 <w:szCs w:val="18"/>
               </w:rPr>
-              <w:t xml:space="preserve">Búsqueda de nombres registrados en el IMPI antes de lanzar</w:t>
+              <w:t xml:space="preserve">Búsqueda de nombres registrados en el IMPI antes del lanzamiento</w:t>
             </w:r>
           </w:p>
         </w:tc>
@@ -10807,6 +11110,21 @@
     </w:tbl>
     <w:p>
       <w:pPr>
+        <w:spacing w:after="80" w:before="80" w:line="240" w:lineRule="auto"/>
+        <w:jc w:val="center"/>
+      </w:pPr>
+      <w:r>
+        <w:rPr>
+          <w:rFonts w:ascii="Arial" w:cs="Arial" w:eastAsia="Arial" w:hAnsi="Arial"/>
+          <w:color w:val="7F7F7F"/>
+          <w:sz w:val="16"/>
+          <w:szCs w:val="16"/>
+        </w:rPr>
+        <w:t xml:space="preserve">Tabla 8. Riesgos de que el CIESS use propiedad intelectual de otras personas.</w:t>
+      </w:r>
+    </w:p>
+    <w:p>
+      <w:pPr>
         <w:spacing w:after="240" w:before="60" w:line="240" w:lineRule="auto"/>
       </w:pPr>
       <w:r>
@@ -10825,7 +11143,7 @@
           <w:sz w:val="18"/>
           <w:szCs w:val="18"/>
         </w:rPr>
-        <w:t xml:space="preserve"> Elaboración propia con base en la Lección 10, Uceda Carrillo (2025), Bernal Guzmán (2025) y la LFDA (2026).</w:t>
+        <w:t xml:space="preserve"> Prob. = probabilidad. Los valores entre paréntesis son el producto de probabilidad por impacto. Elaboración propia con base en la Lección 10 (UVEG, s.f.), Uceda Carrillo (2025), Bernal Guzmán (2025) y la LFDA (2026).</w:t>
       </w:r>
     </w:p>
     <w:p>
@@ -10840,7 +11158,7 @@
           <w:sz w:val="24"/>
           <w:szCs w:val="24"/>
         </w:rPr>
-        <w:t xml:space="preserve">El control que más me importa es el inventario: una lista de cada imagen, fuente, música, </w:t>
+        <w:t xml:space="preserve">El control principal es el inventario: un listado de cada imagen, tipografía, música, </w:t>
       </w:r>
       <w:r>
         <w:rPr>
@@ -10858,7 +11176,7 @@
           <w:sz w:val="24"/>
           <w:szCs w:val="24"/>
         </w:rPr>
-        <w:t xml:space="preserve"> y biblioteca de código, con su fuente, su licencia y quién la autorizó. Con eso, la regla es simple: nada se publica sin saber de dónde viene. Para textos se cita con la fuente y se pide permiso si la parte tomada es importante (LFDA, 2026, art. 148). Para Creative Commons se da atribución (título, autoría, fuente y licencia) y se revisa si NC impide su uso en cursos de paga.</w:t>
+        <w:t xml:space="preserve"> y biblioteca de código, con su origen, su licencia y la persona que autorizó su uso. Con base en él, rige una regla: ningún material se publica sin haber verificado su origen. Para textos se cita indicando la fuente y sin sustituir la obra, porque México no tiene un “uso justo” abierto (LFDA, 2026, art. 148), y para imágenes, tablas y videos se solicita autorización o licencia. Para Creative Commons se otorga la atribución (título, autoría, fuente y licencia) y se verifica si la condición NC impide su uso en cursos de pago (Creative Commons, s.f.).</w:t>
       </w:r>
     </w:p>
     <w:p>
@@ -10873,7 +11191,7 @@
           <w:sz w:val="24"/>
           <w:szCs w:val="24"/>
         </w:rPr>
-        <w:t xml:space="preserve">Antes de grabar o publicar a ponentes y docentes se firma un formato que cubra la obra, la voz y la imagen (LFDA, 2026, art. 87; LFPDPPP, 2025). Si las personas del equipo usan IA generativa, revisan lo que produce, no ingresan material ajeno ni datos personales y no usan bases de datos sin licencia para alimentarla, tema que Bernal Guzmán (2025) señala como un reto abierto.</w:t>
+        <w:t xml:space="preserve">Antes de grabar o publicar la participación de ponentes y docentes, se firma un formato de autorización que cubra la obra, la voz y la imagen (LFDA, 2026, art. 87; LFPDPPP, 2025). Como el CIESS ya usa asistentes de IA para programar (apartado 8), la política de uso de IA exigirá revisar lo que estos generan, no ingresar material ajeno ni datos personales y no usar bases de datos sin licencia para entrenar los sistemas de IA, aspecto que Bernal Guzmán (2025) señala como un reto que la normativa actual aún no resuelve.</w:t>
       </w:r>
     </w:p>
     <w:p>
@@ -10894,7 +11212,7 @@
           <w:sz w:val="24"/>
           <w:szCs w:val="24"/>
         </w:rPr>
-        <w:t xml:space="preserve">6.4 Si ocurre un incidente</w:t>
+        <w:t xml:space="preserve">6.4 Respuesta ante incidentes</w:t>
       </w:r>
     </w:p>
     <w:p>
@@ -10909,7 +11227,7 @@
           <w:sz w:val="24"/>
           <w:szCs w:val="24"/>
         </w:rPr>
-        <w:t xml:space="preserve">Si detecto que usan algo del CIESS sin permiso, seguiré estos pasos:</w:t>
+        <w:t xml:space="preserve">Si detecto que un tercero utiliza material del CIESS sin autorización, seguiré estos pasos:</w:t>
       </w:r>
     </w:p>
     <w:p>
@@ -10966,7 +11284,7 @@
           <w:sz w:val="24"/>
           <w:szCs w:val="24"/>
         </w:rPr>
-        <w:t xml:space="preserve">Enviar una carta o aviso de cese a quien lo publicó y pedir el retiro a la plataforma.</w:t>
+        <w:t xml:space="preserve">Enviar una carta certificada con acuse de recibo, o un aviso de cese, a quien lo publicó y pedir el retiro a la plataforma (Uceda Carrillo, 2025).</w:t>
       </w:r>
     </w:p>
     <w:p>
@@ -10985,7 +11303,7 @@
           <w:sz w:val="24"/>
           <w:szCs w:val="24"/>
         </w:rPr>
-        <w:t xml:space="preserve">Si no hay respuesta, valorar con el área jurídica una vía ante el IMPI, INDAUTOR, la mediación o los tribunales (Uceda Carrillo, 2025).</w:t>
+        <w:t xml:space="preserve">Si no hay respuesta, valorar con el área jurídica la mediación, el arbitraje o los tribunales (Uceda Carrillo, 2025), o una vía administrativa ante el IMPI o INDAUTOR (LFPPI, 2026; LFDA, 2026).</w:t>
       </w:r>
     </w:p>
     <w:p>
@@ -11000,7 +11318,7 @@
           <w:sz w:val="24"/>
           <w:szCs w:val="24"/>
         </w:rPr>
-        <w:t xml:space="preserve">Si el CIESS recibe un reclamo, el proceso es el inverso: retirar de inmediato el contenido señalado, revisar la licencia o la cesión que lo respalda, responder por escrito con apoyo jurídico y corregir el inventario.</w:t>
+        <w:t xml:space="preserve">Si el CIESS recibe una reclamación, el procedimiento es inverso: retirar de inmediato el contenido señalado, revisar la licencia o la cesión que lo respalda, responder por escrito con apoyo jurídico y corregir el inventario.</w:t>
       </w:r>
     </w:p>
     <w:p>
@@ -11056,38 +11374,6 @@
           <w:szCs w:val="24"/>
         </w:rPr>
         <w:t xml:space="preserve">La Tabla 9 asigna a cada riesgo un responsable, un plazo en meses desde la aprobación del plan y un indicador. Las personas responsables son la Dirección, que aprueba políticas y presupuesto; yo, como responsable de PI; el área jurídica, que revisa contratos y formatos; y los responsables de cada área, que piden autorización y licencia antes de publicar material de terceros.</w:t>
-      </w:r>
-    </w:p>
-    <w:p>
-      <w:pPr>
-        <w:keepNext/>
-        <w:spacing w:after="0" w:before="0" w:line="360" w:lineRule="auto"/>
-      </w:pPr>
-      <w:r>
-        <w:rPr>
-          <w:rFonts w:ascii="Arial" w:cs="Arial" w:eastAsia="Arial" w:hAnsi="Arial"/>
-          <w:b/>
-          <w:bCs/>
-          <w:sz w:val="24"/>
-          <w:szCs w:val="24"/>
-        </w:rPr>
-        <w:t xml:space="preserve">Tabla 9</w:t>
-      </w:r>
-    </w:p>
-    <w:p>
-      <w:pPr>
-        <w:keepNext/>
-        <w:spacing w:after="0" w:before="0" w:line="360" w:lineRule="auto"/>
-      </w:pPr>
-      <w:r>
-        <w:rPr>
-          <w:rFonts w:ascii="Arial" w:cs="Arial" w:eastAsia="Arial" w:hAnsi="Arial"/>
-          <w:i/>
-          <w:iCs/>
-          <w:sz w:val="24"/>
-          <w:szCs w:val="24"/>
-        </w:rPr>
-        <w:t xml:space="preserve">Responsables, plazos e indicadores por riesgo</w:t>
       </w:r>
     </w:p>
     <w:tbl>
@@ -11527,7 +11813,7 @@
                 <w:sz w:val="18"/>
                 <w:szCs w:val="18"/>
               </w:rPr>
-              <w:t xml:space="preserve">Estatus de las marcas conocido; una revisión mensual del boletín y de las redes</w:t>
+              <w:t xml:space="preserve">Estatus de las marcas conocido; una revisión mensual de la Gaceta del IMPI y de las redes</w:t>
             </w:r>
           </w:p>
         </w:tc>
@@ -11664,7 +11950,7 @@
                 <w:sz w:val="18"/>
                 <w:szCs w:val="18"/>
               </w:rPr>
-              <w:t xml:space="preserve">Ningún envío de código o bases a cuentas externas; accesos revisados cada trimestre</w:t>
+              <w:t xml:space="preserve">Cero envíos de código o bases a cuentas externas no autorizadas detectados por las reglas DLP; accesos revisados cada trimestre</w:t>
             </w:r>
           </w:p>
         </w:tc>
@@ -11801,7 +12087,7 @@
                 <w:sz w:val="18"/>
                 <w:szCs w:val="18"/>
               </w:rPr>
-              <w:t xml:space="preserve">100 % de los contratos nuevos con cláusula de derechos; los vigentes, al renovarse</w:t>
+              <w:t xml:space="preserve">100 % de los contratos nuevos con cláusula de derechos; los vigentes del logotipo, el sistema de registro y el campus, regularizados en el mes 4, y el resto, al renovarse</w:t>
             </w:r>
           </w:p>
         </w:tc>
@@ -11938,7 +12224,7 @@
                 <w:sz w:val="18"/>
                 <w:szCs w:val="18"/>
               </w:rPr>
-              <w:t xml:space="preserve">Expediente de creación del logotipo, del sistema de registro y de 3 materiales clave</w:t>
+              <w:t xml:space="preserve">Expediente de creación del logotipo, del sistema de registro y de tres materiales clave</w:t>
             </w:r>
           </w:p>
         </w:tc>
@@ -12316,7 +12602,7 @@
                 <w:sz w:val="18"/>
                 <w:szCs w:val="18"/>
               </w:rPr>
-              <w:t xml:space="preserve">Mes 2 (sitio y campus) y mes 4 (resto)</w:t>
+              <w:t xml:space="preserve">Mes 2 (imágenes nuevas) y mes 4 (ya publicadas)</w:t>
             </w:r>
           </w:p>
         </w:tc>
@@ -12349,7 +12635,7 @@
                 <w:sz w:val="18"/>
                 <w:szCs w:val="18"/>
               </w:rPr>
-              <w:t xml:space="preserve">100 % de las imágenes del sitio principal con fuente y licencia</w:t>
+              <w:t xml:space="preserve">100 % de las imágenes nuevas con origen y licencia desde el mes 2; al menos 80 % de las ya publicadas en el mes 4, y el resto se sustituye o se retira</w:t>
             </w:r>
           </w:p>
         </w:tc>
@@ -12921,6 +13207,21 @@
         </w:tc>
       </w:tr>
     </w:tbl>
+    <w:p>
+      <w:pPr>
+        <w:spacing w:after="80" w:before="80" w:line="240" w:lineRule="auto"/>
+        <w:jc w:val="center"/>
+      </w:pPr>
+      <w:r>
+        <w:rPr>
+          <w:rFonts w:ascii="Arial" w:cs="Arial" w:eastAsia="Arial" w:hAnsi="Arial"/>
+          <w:color w:val="7F7F7F"/>
+          <w:sz w:val="16"/>
+          <w:szCs w:val="16"/>
+        </w:rPr>
+        <w:t xml:space="preserve">Tabla 9. Responsables, plazos e indicadores por riesgo.</w:t>
+      </w:r>
+    </w:p>
     <w:p>
       <w:pPr>
         <w:spacing w:after="240" w:before="60" w:line="240" w:lineRule="auto"/>
@@ -12956,7 +13257,7 @@
           <w:sz w:val="24"/>
           <w:szCs w:val="24"/>
         </w:rPr>
-        <w:t xml:space="preserve">Al final del mes 6 mediré el resultado general: los riesgos A4, A2, B1 y B5, que hoy son altos, deben pasar a nivel medio o bajo, como indica la columna de riesgo residual.</w:t>
+        <w:t xml:space="preserve">Al final del mes 6 evaluaré el resultado general: los riesgos A2, A4, B1 y B5, que actualmente se clasifican como altos, deben reducirse a nivel medio o bajo, conforme a la columna de riesgo residual.</w:t>
       </w:r>
     </w:p>
     <w:p>
@@ -12992,39 +13293,7 @@
           <w:sz w:val="24"/>
           <w:szCs w:val="24"/>
         </w:rPr>
-        <w:t xml:space="preserve">El plan dura 6 meses y empieza por el inventario y los contratos, que sostienen todo lo demás (Tabla 10). Después de esa fecha mantengo tres revisiones: cada mes, la vigilancia y el boletín del IMPI; cada tres meses, el inventario y las licencias por vencer; y cada año, las renovaciones (las marcas duran 10 años) y la tabla de riesgos.</w:t>
-      </w:r>
-    </w:p>
-    <w:p>
-      <w:pPr>
-        <w:keepNext/>
-        <w:spacing w:after="0" w:before="0" w:line="360" w:lineRule="auto"/>
-      </w:pPr>
-      <w:r>
-        <w:rPr>
-          <w:rFonts w:ascii="Arial" w:cs="Arial" w:eastAsia="Arial" w:hAnsi="Arial"/>
-          <w:b/>
-          <w:bCs/>
-          <w:sz w:val="24"/>
-          <w:szCs w:val="24"/>
-        </w:rPr>
-        <w:t xml:space="preserve">Tabla 10</w:t>
-      </w:r>
-    </w:p>
-    <w:p>
-      <w:pPr>
-        <w:keepNext/>
-        <w:spacing w:after="0" w:before="0" w:line="360" w:lineRule="auto"/>
-      </w:pPr>
-      <w:r>
-        <w:rPr>
-          <w:rFonts w:ascii="Arial" w:cs="Arial" w:eastAsia="Arial" w:hAnsi="Arial"/>
-          <w:i/>
-          <w:iCs/>
-          <w:sz w:val="24"/>
-          <w:szCs w:val="24"/>
-        </w:rPr>
-        <w:t xml:space="preserve">Cronograma de implementación a 6 meses</w:t>
+        <w:t xml:space="preserve">El plan dura 6 meses y comienza con el inventario (mes 1) y con los formatos y contratos (desde el mes 2), que constituyen la base de las demás actividades (Tabla 10). Después del mes 6 mantendré tres revisiones: cada mes, la vigilancia de usos indebidos y de la Gaceta del IMPI; cada tres meses, el inventario y las licencias próximas a vencer; y cada año, las renovaciones (las marcas tienen una vigencia de 10 años) y la matriz de riesgos.</w:t>
       </w:r>
     </w:p>
     <w:tbl>
@@ -13404,6 +13673,7 @@
               <w:bottom w:val="single" w:color="7F7F7F" w:sz="4"/>
               <w:right w:val="single" w:color="7F7F7F" w:sz="4"/>
             </w:tcBorders>
+            <w:shd w:fill="2E75B6" w:color="auto" w:val="clear"/>
             <w:tcMar>
               <w:top w:type="dxa" w:w="40"/>
               <w:left w:type="dxa" w:w="60"/>
@@ -13429,6 +13699,7 @@
               <w:bottom w:val="single" w:color="7F7F7F" w:sz="4"/>
               <w:right w:val="single" w:color="7F7F7F" w:sz="4"/>
             </w:tcBorders>
+            <w:shd w:fill="2E75B6" w:color="auto" w:val="clear"/>
             <w:tcMar>
               <w:top w:type="dxa" w:w="40"/>
               <w:left w:type="dxa" w:w="60"/>
@@ -13720,7 +13991,7 @@
                 <w:sz w:val="18"/>
                 <w:szCs w:val="18"/>
               </w:rPr>
-              <w:t xml:space="preserve">3. Avisos de derechos y licencias visibles en sitio, campus y materiales</w:t>
+              <w:t xml:space="preserve">3. Avisos de derechos, licencias y controles técnicos (accesos, cifrado, marcas de agua y DLP)</w:t>
             </w:r>
           </w:p>
         </w:tc>
@@ -13810,6 +14081,7 @@
               <w:bottom w:val="single" w:color="7F7F7F" w:sz="4"/>
               <w:right w:val="single" w:color="7F7F7F" w:sz="4"/>
             </w:tcBorders>
+            <w:shd w:fill="2E75B6" w:color="auto" w:val="clear"/>
             <w:tcMar>
               <w:top w:type="dxa" w:w="40"/>
               <w:left w:type="dxa" w:w="60"/>
@@ -14834,6 +15106,21 @@
     </w:tbl>
     <w:p>
       <w:pPr>
+        <w:spacing w:after="80" w:before="80" w:line="240" w:lineRule="auto"/>
+        <w:jc w:val="center"/>
+      </w:pPr>
+      <w:r>
+        <w:rPr>
+          <w:rFonts w:ascii="Arial" w:cs="Arial" w:eastAsia="Arial" w:hAnsi="Arial"/>
+          <w:color w:val="7F7F7F"/>
+          <w:sz w:val="16"/>
+          <w:szCs w:val="16"/>
+        </w:rPr>
+        <w:t xml:space="preserve">Tabla 10. Cronograma de implementación a 6 meses.</w:t>
+      </w:r>
+    </w:p>
+    <w:p>
+      <w:pPr>
         <w:spacing w:after="240" w:before="60" w:line="240" w:lineRule="auto"/>
       </w:pPr>
       <w:r>
@@ -14852,7 +15139,7 @@
           <w:sz w:val="18"/>
           <w:szCs w:val="18"/>
         </w:rPr>
-        <w:t xml:space="preserve"> Los meses se cuentan desde la aprobación del plan. Elaboración propia.</w:t>
+        <w:t xml:space="preserve"> Los meses se cuentan desde la aprobación del plan. La capacitación breve va dirigida a quien publica contenido o contrata proveedores; su meta es una asistencia de al menos 80 %. Elaboración propia.</w:t>
       </w:r>
     </w:p>
     <w:p>
@@ -14886,39 +15173,7 @@
           <w:sz w:val="24"/>
           <w:szCs w:val="24"/>
         </w:rPr>
-        <w:t xml:space="preserve">Cada acción del plan parte de lo que hago hoy. La Tabla 11 indica, por función, qué PI interviene, de quién es y qué propone el plan.</w:t>
-      </w:r>
-    </w:p>
-    <w:p>
-      <w:pPr>
-        <w:keepNext/>
-        <w:spacing w:after="0" w:before="0" w:line="360" w:lineRule="auto"/>
-      </w:pPr>
-      <w:r>
-        <w:rPr>
-          <w:rFonts w:ascii="Arial" w:cs="Arial" w:eastAsia="Arial" w:hAnsi="Arial"/>
-          <w:b/>
-          <w:bCs/>
-          <w:sz w:val="24"/>
-          <w:szCs w:val="24"/>
-        </w:rPr>
-        <w:t xml:space="preserve">Tabla 11</w:t>
-      </w:r>
-    </w:p>
-    <w:p>
-      <w:pPr>
-        <w:keepNext/>
-        <w:spacing w:after="0" w:before="0" w:line="360" w:lineRule="auto"/>
-      </w:pPr>
-      <w:r>
-        <w:rPr>
-          <w:rFonts w:ascii="Arial" w:cs="Arial" w:eastAsia="Arial" w:hAnsi="Arial"/>
-          <w:i/>
-          <w:iCs/>
-          <w:sz w:val="24"/>
-          <w:szCs w:val="24"/>
-        </w:rPr>
-        <w:t xml:space="preserve">Relación entre mi trabajo actual y el plan</w:t>
+        <w:t xml:space="preserve">Cada acción del plan se fundamenta en las funciones que desempeño actualmente. La Tabla 11 indica, por función, qué PI interviene, de quién es y qué propone el plan.</w:t>
       </w:r>
     </w:p>
     <w:tbl>
@@ -15012,7 +15267,7 @@
                 <w:sz w:val="18"/>
                 <w:szCs w:val="18"/>
               </w:rPr>
-              <w:t xml:space="preserve">Qué PI interviene</w:t>
+              <w:t xml:space="preserve">PI involucrada</w:t>
             </w:r>
           </w:p>
         </w:tc>
@@ -15048,7 +15303,7 @@
                 <w:sz w:val="18"/>
                 <w:szCs w:val="18"/>
               </w:rPr>
-              <w:t xml:space="preserve">Quién es titular (hasta donde sé)</w:t>
+              <w:t xml:space="preserve">Titularidad (según la información disponible)</w:t>
             </w:r>
           </w:p>
         </w:tc>
@@ -15084,7 +15339,7 @@
                 <w:sz w:val="18"/>
                 <w:szCs w:val="18"/>
               </w:rPr>
-              <w:t xml:space="preserve">Qué propone el plan</w:t>
+              <w:t xml:space="preserve">Acción propuesta por el plan</w:t>
             </w:r>
           </w:p>
         </w:tc>
@@ -15122,7 +15377,7 @@
                 <w:sz w:val="18"/>
                 <w:szCs w:val="18"/>
               </w:rPr>
-              <w:t xml:space="preserve">Logotipo actual y rediseño de identidad 2020–2022, que diseñé</w:t>
+              <w:t xml:space="preserve">Logotipo actual, que diseñé, y rediseño de identidad 2020–2022, en el que participé</w:t>
             </w:r>
           </w:p>
         </w:tc>
@@ -15188,7 +15443,7 @@
                 <w:sz w:val="18"/>
                 <w:szCs w:val="18"/>
               </w:rPr>
-              <w:t xml:space="preserve">Los derechos morales son míos. Los patrimoniales dependen de mi contrato (LFDA, 2026, art. 84)</w:t>
+              <w:t xml:space="preserve">Los derechos morales del logotipo me corresponden como autor. Los patrimoniales dependen de mi contrato (LFDA, 2026, art. 84)</w:t>
             </w:r>
           </w:p>
         </w:tc>
@@ -15480,7 +15735,7 @@
                 <w:sz w:val="18"/>
                 <w:szCs w:val="18"/>
               </w:rPr>
-              <w:t xml:space="preserve">El CIESS en lo que creo como empleado (LFDA, 2026, art. 103), salvo pacto</w:t>
+              <w:t xml:space="preserve">El CIESS, respecto de lo que desarrollo como empleado (LFDA, 2026, art. 103), salvo pacto</w:t>
             </w:r>
           </w:p>
         </w:tc>
@@ -15948,6 +16203,21 @@
         </w:tc>
       </w:tr>
     </w:tbl>
+    <w:p>
+      <w:pPr>
+        <w:spacing w:after="80" w:before="80" w:line="240" w:lineRule="auto"/>
+        <w:jc w:val="center"/>
+      </w:pPr>
+      <w:r>
+        <w:rPr>
+          <w:rFonts w:ascii="Arial" w:cs="Arial" w:eastAsia="Arial" w:hAnsi="Arial"/>
+          <w:color w:val="7F7F7F"/>
+          <w:sz w:val="16"/>
+          <w:szCs w:val="16"/>
+        </w:rPr>
+        <w:t xml:space="preserve">Tabla 11. Relación entre mi trabajo actual y el plan.</w:t>
+      </w:r>
+    </w:p>
     <w:p>
       <w:pPr>
         <w:spacing w:after="240" w:before="60" w:line="240" w:lineRule="auto"/>
@@ -15993,7 +16263,7 @@
           <w:sz w:val="24"/>
           <w:szCs w:val="24"/>
         </w:rPr>
-        <w:t xml:space="preserve"> Lo diseñé yo, así que mis derechos morales (que se me reconozca como autor y que no se altere mi obra) no se pueden ceder. Según la LFDA (2026, art. 84), si mi contrato es individual y está por escrito, y no hay otro pacto, los derechos patrimoniales se dividen por partes iguales entre el CIESS y yo. Si no hay contrato por escrito, corresponden a la persona empleada. Para que el CIESS pueda registrar y defender la marca sin dudas, lo adecuado es formalizar por escrito la cesión de los derechos patrimoniales.</w:t>
+        <w:t xml:space="preserve"> Soy autor del diseño, por lo que mis derechos morales (el reconocimiento como autor y la integridad de la obra) no pueden cederse. Según la LFDA (2026, art. 84), si mi contrato es individual y está por escrito, y no hay otro pacto, se presume que los derechos patrimoniales se dividen por partes iguales entre el CIESS y yo. Si no hay contrato por escrito, corresponden a la persona empleada. Para que el CIESS pueda registrar y defender la marca con certeza jurídica, lo adecuado es formalizar por escrito la cesión de los derechos patrimoniales.</w:t>
       </w:r>
     </w:p>
     <w:p>
@@ -16018,7 +16288,7 @@
           <w:sz w:val="24"/>
           <w:szCs w:val="24"/>
         </w:rPr>
-        <w:t xml:space="preserve"> Desarrollé el sistema y su base de datos de participantes. El código se protege como obra y, en principio, es del CIESS por haberlo creado en mis funciones (LFDA, 2026, art. 103). La lista de participantes probablemente no sea una obra original (Bernal Guzmán, 2025), así que la cuido como secreto industrial con accesos limitados, y porque contiene datos personales. Antes de publicar cualquier parte del código, revisaré las licencias de las bibliotecas de código abierto que usa.</w:t>
+        <w:t xml:space="preserve"> Desarrollé el sistema y su base de datos de participantes. El código se protege como obra y, en principio, corresponde al CIESS, por haberlo creado yo en el ejercicio de mis funciones (LFDA, 2026, art. 103). La lista de participantes probablemente no sea una obra original (Bernal Guzmán, 2025), por lo que se protege como secreto industrial, con accesos limitados, y recibe un tratamiento reforzado debido a que contiene datos personales. Antes de publicar cualquier parte del código, revisaré las licencias de las bibliotecas de código abierto que este utiliza.</w:t>
       </w:r>
     </w:p>
     <w:p>
@@ -16052,7 +16322,7 @@
           <w:sz w:val="24"/>
           <w:szCs w:val="24"/>
         </w:rPr>
-        <w:t xml:space="preserve">Este plan aterriza la Lección 10, el manual de Uceda Carrillo (2025) y el artículo de Bernal Guzmán (2025) en el trabajo real del CIESS. Define quién es titular de cada obra, qué tipos de PI aplican y qué normas nacionales e internacionales intervienen. Propone controles, responsables, plazos e indicadores en los dos sentidos: proteger lo propio y no usar lo ajeno sin permiso. Lo que más aprendí es que los derechos de autor nacen solos, pero sin contratos, registros y vigilancia una organización no puede demostrar ni defender lo que es suyo. Por eso el plan empieza por el inventario y los contratos.</w:t>
+        <w:t xml:space="preserve">Este plan aplica los contenidos de la Lección 10, del capítulo 1 de Uceda Carrillo (2025) y del artículo de Bernal Guzmán (2025) al contexto operativo del CIESS. Define la titularidad, los tipos de PI y las normas aplicables, y propone controles, responsables, plazos e indicadores en ambos sentidos: proteger la PI propia y no utilizar la PI ajena sin autorización. Una conclusión central es que los derechos de autor surgen sin trámite, pero sin contratos, registros y vigilancia una organización difícilmente puede acreditar o defender su titularidad. En consecuencia, el plan inicia con el inventario y los contratos.</w:t>
       </w:r>
     </w:p>
     <w:p>
@@ -16124,7 +16394,7 @@
         </w:rPr>
         <w:t xml:space="preserve">(1), 3–35. </w:t>
       </w:r>
-      <w:hyperlink w:history="1" r:id="rIdxelheom-j7ikyttlbutyd">
+      <w:hyperlink w:history="1" r:id="rIdzbpz1assahsv1r2vi6axx">
         <w:r>
           <w:rPr>
             <w:rStyle w:val="Hyperlink"/>
@@ -16148,7 +16418,7 @@
           <w:sz w:val="24"/>
           <w:szCs w:val="24"/>
         </w:rPr>
-        <w:t xml:space="preserve">Cámara de Diputados del Honorable Congreso de la Unión [CDHCU]. (2026). </w:t>
+        <w:t xml:space="preserve">Cámara de Diputados del Honorable Congreso de la Unión [CDHCU]. (20 de marzo de 2025). </w:t>
       </w:r>
       <w:r>
         <w:rPr>
@@ -16158,7 +16428,7 @@
           <w:sz w:val="24"/>
           <w:szCs w:val="24"/>
         </w:rPr>
-        <w:t xml:space="preserve">Ley Federal del Derecho de Autor</w:t>
+        <w:t xml:space="preserve">Ley Federal de Protección de Datos Personales en Posesión de los Particulares</w:t>
       </w:r>
       <w:r>
         <w:rPr>
@@ -16168,7 +16438,51 @@
         </w:rPr>
         <w:t xml:space="preserve">. Diario Oficial de la Federación. México: Cámara de Diputados del Honorable Congreso de la Unión. Recuperada el 11 de octubre de 2026, de </w:t>
       </w:r>
-      <w:hyperlink w:history="1" r:id="rId9lq1fuwvavx-vfblin_nq">
+      <w:hyperlink w:history="1" r:id="rId0oj3b3z2yipej6b72c9cd">
+        <w:r>
+          <w:rPr>
+            <w:rStyle w:val="Hyperlink"/>
+            <w:rFonts w:ascii="Arial" w:cs="Arial" w:eastAsia="Arial" w:hAnsi="Arial"/>
+            <w:sz w:val="24"/>
+            <w:szCs w:val="24"/>
+          </w:rPr>
+          <w:t xml:space="preserve">https://www.diputados.gob.mx/LeyesBiblio/pdf/LFPDPPP.pdf</w:t>
+        </w:r>
+      </w:hyperlink>
+    </w:p>
+    <w:p>
+      <w:pPr>
+        <w:spacing w:after="0" w:before="0" w:line="360" w:lineRule="auto"/>
+        <w:ind w:left="720" w:hanging="720"/>
+        <w:jc w:val="left"/>
+      </w:pPr>
+      <w:r>
+        <w:rPr>
+          <w:rFonts w:ascii="Arial" w:cs="Arial" w:eastAsia="Arial" w:hAnsi="Arial"/>
+          <w:sz w:val="24"/>
+          <w:szCs w:val="24"/>
+        </w:rPr>
+        <w:t xml:space="preserve">Cámara de Diputados del Honorable Congreso de la Unión [CDHCU]. (2026). </w:t>
+      </w:r>
+      <w:r>
+        <w:rPr>
+          <w:rFonts w:ascii="Arial" w:cs="Arial" w:eastAsia="Arial" w:hAnsi="Arial"/>
+          <w:i/>
+          <w:iCs/>
+          <w:sz w:val="24"/>
+          <w:szCs w:val="24"/>
+        </w:rPr>
+        <w:t xml:space="preserve">Ley Federal del Derecho de Autor</w:t>
+      </w:r>
+      <w:r>
+        <w:rPr>
+          <w:rFonts w:ascii="Arial" w:cs="Arial" w:eastAsia="Arial" w:hAnsi="Arial"/>
+          <w:sz w:val="24"/>
+          <w:szCs w:val="24"/>
+        </w:rPr>
+        <w:t xml:space="preserve">. Diario Oficial de la Federación. México: Cámara de Diputados del Honorable Congreso de la Unión. Recuperada el 11 de octubre de 2026, de </w:t>
+      </w:r>
+      <w:hyperlink w:history="1" r:id="rIdop05ftyza0z58t_vfyfii">
         <w:r>
           <w:rPr>
             <w:rStyle w:val="Hyperlink"/>
@@ -16212,7 +16526,7 @@
         </w:rPr>
         <w:t xml:space="preserve">. Diario Oficial de la Federación. México: Cámara de Diputados del Honorable Congreso de la Unión. Recuperada el 11 de octubre de 2026, de </w:t>
       </w:r>
-      <w:hyperlink w:history="1" r:id="rIdxdm27otgp6xyr7xtrk1qe">
+      <w:hyperlink w:history="1" r:id="rIdlvdf-w3kuzpijruc3ogwt">
         <w:r>
           <w:rPr>
             <w:rStyle w:val="Hyperlink"/>
@@ -16236,7 +16550,7 @@
           <w:sz w:val="24"/>
           <w:szCs w:val="24"/>
         </w:rPr>
-        <w:t xml:space="preserve">Cámara de Diputados del Honorable Congreso de la Unión [CDHCU]. (20 de marzo de 2025). </w:t>
+        <w:t xml:space="preserve">Centro Español de Derechos Reprográficos. (2024). </w:t>
       </w:r>
       <w:r>
         <w:rPr>
@@ -16246,7 +16560,7 @@
           <w:sz w:val="24"/>
           <w:szCs w:val="24"/>
         </w:rPr>
-        <w:t xml:space="preserve">Ley Federal de Protección de Datos Personales en Posesión de los Particulares</w:t>
+        <w:t xml:space="preserve">El Convenio de Berna y los derechos de autor</w:t>
       </w:r>
       <w:r>
         <w:rPr>
@@ -16254,53 +16568,9 @@
           <w:sz w:val="24"/>
           <w:szCs w:val="24"/>
         </w:rPr>
-        <w:t xml:space="preserve">. Diario Oficial de la Federación. México: Cámara de Diputados del Honorable Congreso de la Unión. Recuperada el 11 de octubre de 2026, de </w:t>
-      </w:r>
-      <w:hyperlink w:history="1" r:id="rIdiaxiojhkpdhhkk2tb7log">
-        <w:r>
-          <w:rPr>
-            <w:rStyle w:val="Hyperlink"/>
-            <w:rFonts w:ascii="Arial" w:cs="Arial" w:eastAsia="Arial" w:hAnsi="Arial"/>
-            <w:sz w:val="24"/>
-            <w:szCs w:val="24"/>
-          </w:rPr>
-          <w:t xml:space="preserve">https://www.diputados.gob.mx/LeyesBiblio/pdf/LFPDPPP.pdf</w:t>
-        </w:r>
-      </w:hyperlink>
-    </w:p>
-    <w:p>
-      <w:pPr>
-        <w:spacing w:after="0" w:before="0" w:line="360" w:lineRule="auto"/>
-        <w:ind w:left="720" w:hanging="720"/>
-        <w:jc w:val="left"/>
-      </w:pPr>
-      <w:r>
-        <w:rPr>
-          <w:rFonts w:ascii="Arial" w:cs="Arial" w:eastAsia="Arial" w:hAnsi="Arial"/>
-          <w:sz w:val="24"/>
-          <w:szCs w:val="24"/>
-        </w:rPr>
-        <w:t xml:space="preserve">Centro Español de Derechos Reprográficos [CEDRO]. (2024). </w:t>
-      </w:r>
-      <w:r>
-        <w:rPr>
-          <w:rFonts w:ascii="Arial" w:cs="Arial" w:eastAsia="Arial" w:hAnsi="Arial"/>
-          <w:i/>
-          <w:iCs/>
-          <w:sz w:val="24"/>
-          <w:szCs w:val="24"/>
-        </w:rPr>
-        <w:t xml:space="preserve">El Convenio de Berna y los derechos de autor</w:t>
-      </w:r>
-      <w:r>
-        <w:rPr>
-          <w:rFonts w:ascii="Arial" w:cs="Arial" w:eastAsia="Arial" w:hAnsi="Arial"/>
-          <w:sz w:val="24"/>
-          <w:szCs w:val="24"/>
-        </w:rPr>
         <w:t xml:space="preserve">. </w:t>
       </w:r>
-      <w:hyperlink w:history="1" r:id="rIdzzco4__i0_ux0xmwwblwq">
+      <w:hyperlink w:history="1" r:id="rIdce1pnx3p4zkvvube617rz">
         <w:r>
           <w:rPr>
             <w:rStyle w:val="Hyperlink"/>
@@ -16344,7 +16614,7 @@
         </w:rPr>
         <w:t xml:space="preserve">. </w:t>
       </w:r>
-      <w:hyperlink w:history="1" r:id="rIdf_vcotnexjeq78-pbgbog">
+      <w:hyperlink w:history="1" r:id="rId_kgpvqdg94b1wgfofzf4q">
         <w:r>
           <w:rPr>
             <w:rStyle w:val="Hyperlink"/>
@@ -16388,7 +16658,7 @@
         </w:rPr>
         <w:t xml:space="preserve">. </w:t>
       </w:r>
-      <w:hyperlink w:history="1" r:id="rIdwqioor764fqjej_wyzvah">
+      <w:hyperlink w:history="1" r:id="rIdcw-zkdybflwyn0qeh2nph">
         <w:r>
           <w:rPr>
             <w:rStyle w:val="Hyperlink"/>
@@ -16432,7 +16702,7 @@
         </w:rPr>
         <w:t xml:space="preserve">. </w:t>
       </w:r>
-      <w:hyperlink w:history="1" r:id="rIdbcpsij7-solqxopbipwbb">
+      <w:hyperlink w:history="1" r:id="rId2yfbqfobuu4ym3dwnhlxg">
         <w:r>
           <w:rPr>
             <w:rStyle w:val="Hyperlink"/>
@@ -16476,7 +16746,7 @@
         </w:rPr>
         <w:t xml:space="preserve">. </w:t>
       </w:r>
-      <w:hyperlink w:history="1" r:id="rIdjhhtn3rb_4i8g7j3wbyp_">
+      <w:hyperlink w:history="1" r:id="rId1wwel5qlmvevnucivmjdm">
         <w:r>
           <w:rPr>
             <w:rStyle w:val="Hyperlink"/>
@@ -16500,7 +16770,7 @@
           <w:sz w:val="24"/>
           <w:szCs w:val="24"/>
         </w:rPr>
-        <w:t xml:space="preserve">Instituto Mexicano de la Propiedad Industrial [IMPI]. (2025). </w:t>
+        <w:t xml:space="preserve">Instituto Mexicano de la Propiedad Industrial. (2025). </w:t>
       </w:r>
       <w:r>
         <w:rPr>
@@ -16520,7 +16790,7 @@
         </w:rPr>
         <w:t xml:space="preserve">. </w:t>
       </w:r>
-      <w:hyperlink w:history="1" r:id="rIdckzumbjg2oaem-nkr_i8_">
+      <w:hyperlink w:history="1" r:id="rIdi9pruqcyohiagzsoib_n5">
         <w:r>
           <w:rPr>
             <w:rStyle w:val="Hyperlink"/>
@@ -16544,7 +16814,7 @@
           <w:sz w:val="24"/>
           <w:szCs w:val="24"/>
         </w:rPr>
-        <w:t xml:space="preserve">Instituto Nacional del Derecho de Autor [INDAUTOR]. (2025). </w:t>
+        <w:t xml:space="preserve">Instituto Nacional del Derecho de Autor. (2025). </w:t>
       </w:r>
       <w:r>
         <w:rPr>
@@ -16564,7 +16834,7 @@
         </w:rPr>
         <w:t xml:space="preserve">. </w:t>
       </w:r>
-      <w:hyperlink w:history="1" r:id="rIdxfipgzhd025b_z_80p-i4">
+      <w:hyperlink w:history="1" r:id="rIdasljttvdp3rvowodfouvu">
         <w:r>
           <w:rPr>
             <w:rStyle w:val="Hyperlink"/>
@@ -16608,7 +16878,7 @@
         </w:rPr>
         <w:t xml:space="preserve">. </w:t>
       </w:r>
-      <w:hyperlink w:history="1" r:id="rIdf9lk93maebmqumulmbm8k">
+      <w:hyperlink w:history="1" r:id="rId79a-xakzzxdaoopwhk10z">
         <w:r>
           <w:rPr>
             <w:rStyle w:val="Hyperlink"/>
@@ -16632,7 +16902,7 @@
           <w:sz w:val="24"/>
           <w:szCs w:val="24"/>
         </w:rPr>
-        <w:t xml:space="preserve">Organización Mundial de la Propiedad Intelectual [OMPI]. (1979). </w:t>
+        <w:t xml:space="preserve">Organización Mundial de la Propiedad Intelectual. (s.f.). </w:t>
       </w:r>
       <w:r>
         <w:rPr>
@@ -16642,7 +16912,7 @@
           <w:sz w:val="24"/>
           <w:szCs w:val="24"/>
         </w:rPr>
-        <w:t xml:space="preserve">Convenio de Berna para la Protección de las Obras Literarias y Artísticas</w:t>
+        <w:t xml:space="preserve">Convenio de París para la Protección de la Propiedad Industrial</w:t>
       </w:r>
       <w:r>
         <w:rPr>
@@ -16650,9 +16920,53 @@
           <w:sz w:val="24"/>
           <w:szCs w:val="24"/>
         </w:rPr>
+        <w:t xml:space="preserve">. </w:t>
+      </w:r>
+      <w:hyperlink w:history="1" r:id="rIdtuuv-vjm9agdtdw4ogdkt">
+        <w:r>
+          <w:rPr>
+            <w:rStyle w:val="Hyperlink"/>
+            <w:rFonts w:ascii="Arial" w:cs="Arial" w:eastAsia="Arial" w:hAnsi="Arial"/>
+            <w:sz w:val="24"/>
+            <w:szCs w:val="24"/>
+          </w:rPr>
+          <w:t xml:space="preserve">https://www.wipo.int/treaties/es/ip/paris/</w:t>
+        </w:r>
+      </w:hyperlink>
+    </w:p>
+    <w:p>
+      <w:pPr>
+        <w:spacing w:after="0" w:before="0" w:line="360" w:lineRule="auto"/>
+        <w:ind w:left="720" w:hanging="720"/>
+        <w:jc w:val="left"/>
+      </w:pPr>
+      <w:r>
+        <w:rPr>
+          <w:rFonts w:ascii="Arial" w:cs="Arial" w:eastAsia="Arial" w:hAnsi="Arial"/>
+          <w:sz w:val="24"/>
+          <w:szCs w:val="24"/>
+        </w:rPr>
+        <w:t xml:space="preserve">Organización Mundial de la Propiedad Intelectual. (1979). </w:t>
+      </w:r>
+      <w:r>
+        <w:rPr>
+          <w:rFonts w:ascii="Arial" w:cs="Arial" w:eastAsia="Arial" w:hAnsi="Arial"/>
+          <w:i/>
+          <w:iCs/>
+          <w:sz w:val="24"/>
+          <w:szCs w:val="24"/>
+        </w:rPr>
+        <w:t xml:space="preserve">Convenio de Berna para la Protección de las Obras Literarias y Artísticas</w:t>
+      </w:r>
+      <w:r>
+        <w:rPr>
+          <w:rFonts w:ascii="Arial" w:cs="Arial" w:eastAsia="Arial" w:hAnsi="Arial"/>
+          <w:sz w:val="24"/>
+          <w:szCs w:val="24"/>
+        </w:rPr>
         <w:t xml:space="preserve"> (Acta de París de 1971, enmendado en 1979). </w:t>
       </w:r>
-      <w:hyperlink w:history="1" r:id="rIdramv9om1gmtgzz2iob9hn">
+      <w:hyperlink w:history="1" r:id="rId-mhdlq3rgnyzoi0jcw_ea">
         <w:r>
           <w:rPr>
             <w:rStyle w:val="Hyperlink"/>
@@ -16676,7 +16990,7 @@
           <w:sz w:val="24"/>
           <w:szCs w:val="24"/>
         </w:rPr>
-        <w:t xml:space="preserve">Organización Mundial de la Propiedad Intelectual [OMPI]. (1996). </w:t>
+        <w:t xml:space="preserve">Organización Mundial de la Propiedad Intelectual. (1996). </w:t>
       </w:r>
       <w:r>
         <w:rPr>
@@ -16696,7 +17010,7 @@
         </w:rPr>
         <w:t xml:space="preserve">. </w:t>
       </w:r>
-      <w:hyperlink w:history="1" r:id="rId2r0rhwrtmig-28uoavza-">
+      <w:hyperlink w:history="1" r:id="rIdrdqucwdap8jsi5hybs7vt">
         <w:r>
           <w:rPr>
             <w:rStyle w:val="Hyperlink"/>
@@ -16720,7 +17034,7 @@
           <w:sz w:val="24"/>
           <w:szCs w:val="24"/>
         </w:rPr>
-        <w:t xml:space="preserve">Organización Mundial de la Propiedad Intelectual [OMPI]. (2020). </w:t>
+        <w:t xml:space="preserve">Organización Mundial de la Propiedad Intelectual. (2020). </w:t>
       </w:r>
       <w:r>
         <w:rPr>
@@ -16740,7 +17054,7 @@
         </w:rPr>
         <w:t xml:space="preserve"> </w:t>
       </w:r>
-      <w:hyperlink w:history="1" r:id="rId-wuevxwbxci4o8yqtlkdq">
+      <w:hyperlink w:history="1" r:id="rIdkqvckvvp5goa-gitg-v4b">
         <w:r>
           <w:rPr>
             <w:rStyle w:val="Hyperlink"/>
@@ -16764,7 +17078,7 @@
           <w:sz w:val="24"/>
           <w:szCs w:val="24"/>
         </w:rPr>
-        <w:t xml:space="preserve">Organización Mundial de la Propiedad Intelectual [OMPI]. (2025a). </w:t>
+        <w:t xml:space="preserve">Organización Mundial de la Propiedad Intelectual. (2025a). </w:t>
       </w:r>
       <w:r>
         <w:rPr>
@@ -16774,7 +17088,7 @@
           <w:sz w:val="24"/>
           <w:szCs w:val="24"/>
         </w:rPr>
-        <w:t xml:space="preserve">Sistema de Madrid: el sistema internacional de marcas</w:t>
+        <w:t xml:space="preserve">Secretos comerciales</w:t>
       </w:r>
       <w:r>
         <w:rPr>
@@ -16784,7 +17098,51 @@
         </w:rPr>
         <w:t xml:space="preserve">. </w:t>
       </w:r>
-      <w:hyperlink w:history="1" r:id="rIdtdii9tds1zseln8wuaock">
+      <w:hyperlink w:history="1" r:id="rIdv6zzepxszoo5cntq828wj">
+        <w:r>
+          <w:rPr>
+            <w:rStyle w:val="Hyperlink"/>
+            <w:rFonts w:ascii="Arial" w:cs="Arial" w:eastAsia="Arial" w:hAnsi="Arial"/>
+            <w:sz w:val="24"/>
+            <w:szCs w:val="24"/>
+          </w:rPr>
+          <w:t xml:space="preserve">https://www.wipo.int/es/web/trade-secrets</w:t>
+        </w:r>
+      </w:hyperlink>
+    </w:p>
+    <w:p>
+      <w:pPr>
+        <w:spacing w:after="0" w:before="0" w:line="360" w:lineRule="auto"/>
+        <w:ind w:left="720" w:hanging="720"/>
+        <w:jc w:val="left"/>
+      </w:pPr>
+      <w:r>
+        <w:rPr>
+          <w:rFonts w:ascii="Arial" w:cs="Arial" w:eastAsia="Arial" w:hAnsi="Arial"/>
+          <w:sz w:val="24"/>
+          <w:szCs w:val="24"/>
+        </w:rPr>
+        <w:t xml:space="preserve">Organización Mundial de la Propiedad Intelectual. (2025b). </w:t>
+      </w:r>
+      <w:r>
+        <w:rPr>
+          <w:rFonts w:ascii="Arial" w:cs="Arial" w:eastAsia="Arial" w:hAnsi="Arial"/>
+          <w:i/>
+          <w:iCs/>
+          <w:sz w:val="24"/>
+          <w:szCs w:val="24"/>
+        </w:rPr>
+        <w:t xml:space="preserve">Sistema de Madrid: el sistema internacional de marcas</w:t>
+      </w:r>
+      <w:r>
+        <w:rPr>
+          <w:rFonts w:ascii="Arial" w:cs="Arial" w:eastAsia="Arial" w:hAnsi="Arial"/>
+          <w:sz w:val="24"/>
+          <w:szCs w:val="24"/>
+        </w:rPr>
+        <w:t xml:space="preserve">. </w:t>
+      </w:r>
+      <w:hyperlink w:history="1" r:id="rId-pswrquhtumwjtu36nygt">
         <w:r>
           <w:rPr>
             <w:rStyle w:val="Hyperlink"/>
@@ -16808,7 +17166,7 @@
           <w:sz w:val="24"/>
           <w:szCs w:val="24"/>
         </w:rPr>
-        <w:t xml:space="preserve">Organización Mundial de la Propiedad Intelectual [OMPI]. (2025b). </w:t>
+        <w:t xml:space="preserve">Organización Mundial del Comercio. (1994). </w:t>
       </w:r>
       <w:r>
         <w:rPr>
@@ -16818,7 +17176,7 @@
           <w:sz w:val="24"/>
           <w:szCs w:val="24"/>
         </w:rPr>
-        <w:t xml:space="preserve">Secretos comerciales</w:t>
+        <w:t xml:space="preserve">Acuerdo sobre los aspectos de los derechos de propiedad intelectual relacionados con el comercio (ADPIC)</w:t>
       </w:r>
       <w:r>
         <w:rPr>
@@ -16828,51 +17186,7 @@
         </w:rPr>
         <w:t xml:space="preserve">. </w:t>
       </w:r>
-      <w:hyperlink w:history="1" r:id="rId1qdlfjjhtazoc2nijvacu">
-        <w:r>
-          <w:rPr>
-            <w:rStyle w:val="Hyperlink"/>
-            <w:rFonts w:ascii="Arial" w:cs="Arial" w:eastAsia="Arial" w:hAnsi="Arial"/>
-            <w:sz w:val="24"/>
-            <w:szCs w:val="24"/>
-          </w:rPr>
-          <w:t xml:space="preserve">https://www.wipo.int/es/web/trade-secrets</w:t>
-        </w:r>
-      </w:hyperlink>
-    </w:p>
-    <w:p>
-      <w:pPr>
-        <w:spacing w:after="0" w:before="0" w:line="360" w:lineRule="auto"/>
-        <w:ind w:left="720" w:hanging="720"/>
-        <w:jc w:val="left"/>
-      </w:pPr>
-      <w:r>
-        <w:rPr>
-          <w:rFonts w:ascii="Arial" w:cs="Arial" w:eastAsia="Arial" w:hAnsi="Arial"/>
-          <w:sz w:val="24"/>
-          <w:szCs w:val="24"/>
-        </w:rPr>
-        <w:t xml:space="preserve">Organización Mundial del Comercio [OMC]. (1994). </w:t>
-      </w:r>
-      <w:r>
-        <w:rPr>
-          <w:rFonts w:ascii="Arial" w:cs="Arial" w:eastAsia="Arial" w:hAnsi="Arial"/>
-          <w:i/>
-          <w:iCs/>
-          <w:sz w:val="24"/>
-          <w:szCs w:val="24"/>
-        </w:rPr>
-        <w:t xml:space="preserve">Acuerdo sobre los aspectos de los derechos de propiedad intelectual relacionados con el comercio (ADPIC)</w:t>
-      </w:r>
-      <w:r>
-        <w:rPr>
-          <w:rFonts w:ascii="Arial" w:cs="Arial" w:eastAsia="Arial" w:hAnsi="Arial"/>
-          <w:sz w:val="24"/>
-          <w:szCs w:val="24"/>
-        </w:rPr>
-        <w:t xml:space="preserve">. </w:t>
-      </w:r>
-      <w:hyperlink w:history="1" r:id="rIdywp04oirj4j2do_31oq7e">
+      <w:hyperlink w:history="1" r:id="rId6rxcmdjep4oxef1oblvhi">
         <w:r>
           <w:rPr>
             <w:rStyle w:val="Hyperlink"/>
@@ -16916,7 +17230,7 @@
         </w:rPr>
         <w:t xml:space="preserve">. Diario Oficial de la Unión Europea. </w:t>
       </w:r>
-      <w:hyperlink w:history="1" r:id="rId_vlnsibyvzeussdupfx0x">
+      <w:hyperlink w:history="1" r:id="rIdy7dm_hidpwlf6smhpevwj">
         <w:r>
           <w:rPr>
             <w:rStyle w:val="Hyperlink"/>
@@ -16960,7 +17274,7 @@
         </w:rPr>
         <w:t xml:space="preserve">. FC Editorial. </w:t>
       </w:r>
-      <w:hyperlink w:history="1" r:id="rId26vddub-5u_09rc4-kqml">
+      <w:hyperlink w:history="1" r:id="rIdx_0gsnoc_tauax--j74z3">
         <w:r>
           <w:rPr>
             <w:rStyle w:val="Hyperlink"/>

</xml_diff>